<commit_message>
added a bunch more docx templates - still need dismiss and answer and also need to update and add yml templates
</commit_message>
<xml_diff>
--- a/docassemble/AKA2JBranding/data/templates/answer_domestic_violence_content.docx
+++ b/docassemble/AKA2JBranding/data/templates/answer_domestic_violence_content.docx
@@ -18,64 +18,25 @@
         <w:rPr>
           <w:color w:val="FF0000"/>
         </w:rPr>
-        <w:t xml:space="preserve">{% if user_need == 'custody' </w:t>
-      </w:r>
-      <w:proofErr w:type="gramStart"/>
+        <w:t>{% if user_need == 'custody' %}</w:t>
+      </w:r>
+      <w:r>
+        <w:t>People who have experienced domestic violence can be at greater risk when they start a court case</w:t>
+      </w:r>
       <w:r>
         <w:rPr>
           <w:color w:val="FF0000"/>
         </w:rPr>
-        <w:t>%}</w:t>
-      </w:r>
-      <w:r>
-        <w:t>People</w:t>
-      </w:r>
-      <w:proofErr w:type="gramEnd"/>
-      <w:r>
-        <w:t xml:space="preserve"> who have experienced domestic violence can be at greater risk when they start a court case</w:t>
+        <w:t>.{% elif user_need == 'divorce' %}</w:t>
+      </w:r>
+      <w:r>
+        <w:t>People who have experienced domestic violence can be at greater risk when they separate from their spouse or start a court case to end their marriage.</w:t>
       </w:r>
       <w:r>
         <w:rPr>
           <w:color w:val="FF0000"/>
         </w:rPr>
-        <w:t xml:space="preserve">.{% </w:t>
-      </w:r>
-      <w:proofErr w:type="spellStart"/>
-      <w:r>
-        <w:rPr>
-          <w:color w:val="FF0000"/>
-        </w:rPr>
-        <w:t>elif</w:t>
-      </w:r>
-      <w:proofErr w:type="spellEnd"/>
-      <w:r>
-        <w:rPr>
-          <w:color w:val="FF0000"/>
-        </w:rPr>
-        <w:t xml:space="preserve"> user_need == 'divorce' %}</w:t>
-      </w:r>
-      <w:r>
-        <w:t>People who have experienced domestic violence can be at greater risk when they separate from their spouse or start a court case to end their marriage.</w:t>
-      </w:r>
-      <w:r>
-        <w:rPr>
-          <w:color w:val="FF0000"/>
-        </w:rPr>
-        <w:t xml:space="preserve">{% </w:t>
-      </w:r>
-      <w:proofErr w:type="spellStart"/>
-      <w:r>
-        <w:rPr>
-          <w:color w:val="FF0000"/>
-        </w:rPr>
-        <w:t>elif</w:t>
-      </w:r>
-      <w:proofErr w:type="spellEnd"/>
-      <w:r>
-        <w:rPr>
-          <w:color w:val="FF0000"/>
-        </w:rPr>
-        <w:t xml:space="preserve"> user_need in('answer custody', 'answer divorce') %}</w:t>
+        <w:t>{% elif user_need in('answer custody', 'answer divorce') %}</w:t>
       </w:r>
       <w:r>
         <w:t>People who have experienced domestic violence can be at risk during a court case.</w:t>
@@ -195,63 +156,7 @@
         <w:rPr>
           <w:color w:val="FF0000"/>
         </w:rPr>
-        <w:t>{% if ((user_need == 'answer custody' and (type_of_response.all_true('</w:t>
-      </w:r>
-      <w:proofErr w:type="spellStart"/>
-      <w:r>
-        <w:rPr>
-          <w:color w:val="FF0000"/>
-        </w:rPr>
-        <w:t>ak</w:t>
-      </w:r>
-      <w:proofErr w:type="spellEnd"/>
-      <w:r>
-        <w:rPr>
-          <w:color w:val="FF0000"/>
-        </w:rPr>
-        <w:t xml:space="preserve"> custody case', exclusive=True) or type_of_response.all_true('</w:t>
-      </w:r>
-      <w:proofErr w:type="spellStart"/>
-      <w:r>
-        <w:rPr>
-          <w:color w:val="FF0000"/>
-        </w:rPr>
-        <w:t>ak</w:t>
-      </w:r>
-      <w:proofErr w:type="spellEnd"/>
-      <w:r>
-        <w:rPr>
-          <w:color w:val="FF0000"/>
-        </w:rPr>
-        <w:t xml:space="preserve"> custody case', 'improper service', exclusive=True))) or (user_need == 'answer divorce' and (type_of_response.all_true('</w:t>
-      </w:r>
-      <w:proofErr w:type="spellStart"/>
-      <w:r>
-        <w:rPr>
-          <w:color w:val="FF0000"/>
-        </w:rPr>
-        <w:t>ak</w:t>
-      </w:r>
-      <w:proofErr w:type="spellEnd"/>
-      <w:r>
-        <w:rPr>
-          <w:color w:val="FF0000"/>
-        </w:rPr>
-        <w:t xml:space="preserve"> divorce case', exclusive=True) or type_of_response.all_true('</w:t>
-      </w:r>
-      <w:proofErr w:type="spellStart"/>
-      <w:r>
-        <w:rPr>
-          <w:color w:val="FF0000"/>
-        </w:rPr>
-        <w:t>ak</w:t>
-      </w:r>
-      <w:proofErr w:type="spellEnd"/>
-      <w:r>
-        <w:rPr>
-          <w:color w:val="FF0000"/>
-        </w:rPr>
-        <w:t xml:space="preserve"> divorce case', 'improper service', exclusive=True)) and (case_type == 'divorce' or (case_type == 'legal separation' and want_legal_separation == 'yes')))) and (response_to_complaint in ('agree', 'some') or (response_to_complaint == 'none' and </w:t>
+        <w:t xml:space="preserve">{% if ((user_need == 'answer custody' and (type_of_response.all_true('ak custody case', exclusive=True) or type_of_response.all_true('ak custody case', 'improper service', exclusive=True))) or (user_need == 'answer divorce' and (type_of_response.all_true('ak divorce case', exclusive=True) or type_of_response.all_true('ak divorce case', 'improper service', exclusive=True)) and (case_type == 'divorce' or (case_type == 'legal separation' and want_legal_separation == 'yes')))) and (response_to_complaint in ('agree', 'some') or (response_to_complaint == 'none' and </w:t>
       </w:r>
       <w:proofErr w:type="spellStart"/>
       <w:r>
@@ -308,21 +213,7 @@
         <w:rPr>
           <w:color w:val="FFC000"/>
         </w:rPr>
-        <w:t xml:space="preserve">.{% </w:t>
-      </w:r>
-      <w:proofErr w:type="spellStart"/>
-      <w:r>
-        <w:rPr>
-          <w:color w:val="FFC000"/>
-        </w:rPr>
-        <w:t>elif</w:t>
-      </w:r>
-      <w:proofErr w:type="spellEnd"/>
-      <w:r>
-        <w:rPr>
-          <w:color w:val="FFC000"/>
-        </w:rPr>
-        <w:t xml:space="preserve"> user_need == 'answer divorce' %}</w:t>
+        <w:t>.{% elif user_need == 'answer divorce' %}</w:t>
       </w:r>
       <w:r>
         <w:t xml:space="preserve">However, some people in a marriage with domestic violence are comfortable reaching an agreement about </w:t>
@@ -351,15 +242,7 @@
         <w:pStyle w:val="Body"/>
       </w:pPr>
       <w:r>
-        <w:t xml:space="preserve">Sometimes, domestic violence does not make either spouse uncomfortable or afraid to ask for what they want in the </w:t>
-      </w:r>
-      <w:proofErr w:type="gramStart"/>
-      <w:r>
-        <w:t>{{ "</w:t>
-      </w:r>
-      <w:proofErr w:type="gramEnd"/>
-      <w:r>
-        <w:t>Parenting Plan or " if minor_children else "" }}property &amp; debt division.</w:t>
+        <w:t>Sometimes, domestic violence does not make either spouse uncomfortable or afraid to ask for what they want in the {{ "Parenting Plan or " if minor_children else "" }}property &amp; debt division.</w:t>
       </w:r>
     </w:p>
     <w:p>
@@ -389,15 +272,7 @@
         <w:pStyle w:val="Body"/>
       </w:pPr>
       <w:r>
-        <w:t xml:space="preserve">You can decide if you are comfortable trying to reach an agreement with </w:t>
-      </w:r>
-      <w:proofErr w:type="gramStart"/>
-      <w:r>
-        <w:t>{{ other</w:t>
-      </w:r>
-      <w:proofErr w:type="gramEnd"/>
-      <w:r>
-        <w:t>_party_in_case }} based on the facts and circumstances of your case.</w:t>
+        <w:t>You can decide if you are comfortable trying to reach an agreement with {{ other_party_in_case }} based on the facts and circumstances of your case.</w:t>
       </w:r>
       <w:r>
         <w:rPr>
@@ -420,63 +295,31 @@
         <w:rPr>
           <w:color w:val="FFC000"/>
         </w:rPr>
-        <w:t>{% if ((user_need == 'answer custody' and (type_of_response.all_true('</w:t>
-      </w:r>
-      <w:proofErr w:type="spellStart"/>
+        <w:t xml:space="preserve">{% if </w:t>
+      </w:r>
+      <w:r>
+        <w:rPr>
+          <w:color w:val="FF0000"/>
+        </w:rPr>
+        <w:t>(</w:t>
+      </w:r>
       <w:r>
         <w:rPr>
           <w:color w:val="FFC000"/>
         </w:rPr>
-        <w:t>ak</w:t>
-      </w:r>
-      <w:proofErr w:type="spellEnd"/>
+        <w:t>(user_need == 'answer custody' and (type_of_response.all_true('ak custody case', exclusive=True) or type_of_response.all_true('ak custody case', 'improper service', exclusive=True))</w:t>
+      </w:r>
+      <w:r>
+        <w:rPr>
+          <w:color w:val="FF0000"/>
+        </w:rPr>
+        <w:t>) or (</w:t>
+      </w:r>
       <w:r>
         <w:rPr>
           <w:color w:val="FFC000"/>
         </w:rPr>
-        <w:t xml:space="preserve"> custody case', exclusive=True) or type_of_response.all_true('</w:t>
-      </w:r>
-      <w:proofErr w:type="spellStart"/>
-      <w:r>
-        <w:rPr>
-          <w:color w:val="FFC000"/>
-        </w:rPr>
-        <w:t>ak</w:t>
-      </w:r>
-      <w:proofErr w:type="spellEnd"/>
-      <w:r>
-        <w:rPr>
-          <w:color w:val="FFC000"/>
-        </w:rPr>
-        <w:t xml:space="preserve"> custody case', 'improper service', exclusive=True))) or (user_need == 'answer divorce' and (type_of_response.all_true('</w:t>
-      </w:r>
-      <w:proofErr w:type="spellStart"/>
-      <w:r>
-        <w:rPr>
-          <w:color w:val="FFC000"/>
-        </w:rPr>
-        <w:t>ak</w:t>
-      </w:r>
-      <w:proofErr w:type="spellEnd"/>
-      <w:r>
-        <w:rPr>
-          <w:color w:val="FFC000"/>
-        </w:rPr>
-        <w:t xml:space="preserve"> divorce case', exclusive=True) or type_of_response.all_true('</w:t>
-      </w:r>
-      <w:proofErr w:type="spellStart"/>
-      <w:r>
-        <w:rPr>
-          <w:color w:val="FFC000"/>
-        </w:rPr>
-        <w:t>ak</w:t>
-      </w:r>
-      <w:proofErr w:type="spellEnd"/>
-      <w:r>
-        <w:rPr>
-          <w:color w:val="FFC000"/>
-        </w:rPr>
-        <w:t xml:space="preserve"> divorce case', 'improper service', exclusive=True)) and (case_type == 'divorce' or (case_type == 'legal separation' and want_legal_separation == 'yes')))) and (response_to_complaint in ('agree', 'some') or (response_to_complaint == 'none' and </w:t>
+        <w:t xml:space="preserve">user_need == 'answer divorce' and (type_of_response.all_true('ak divorce case', exclusive=True) or type_of_response.all_true('ak divorce case', 'improper service', exclusive=True)) and (case_type == 'divorce' or (case_type == 'legal separation' and want_legal_separation == 'yes')))) and (response_to_complaint in ('agree', 'some') or (response_to_complaint == 'none' and </w:t>
       </w:r>
       <w:proofErr w:type="spellStart"/>
       <w:r>
@@ -490,35 +333,86 @@
         <w:rPr>
           <w:color w:val="FFC000"/>
         </w:rPr>
-        <w:t>)) %}</w:t>
-      </w:r>
-      <w:r>
-        <w:t>If you want to try to reach an agreement about the Parenting Plan, your options may be limited if there has been domestic violence.</w:t>
-      </w:r>
-    </w:p>
-    <w:p>
-      <w:pPr>
-        <w:pStyle w:val="Heading3"/>
-      </w:pPr>
-      <w:r>
-        <w:t xml:space="preserve">Your Parenting Plan agreement may be limited if there is domestic </w:t>
-      </w:r>
-      <w:proofErr w:type="gramStart"/>
-      <w:r>
-        <w:t>violence</w:t>
+        <w:t>)</w:t>
+      </w:r>
+      <w:r>
+        <w:rPr>
+          <w:color w:val="FF0000"/>
+        </w:rPr>
+        <w:t xml:space="preserve">) </w:t>
+      </w:r>
+      <w:r>
+        <w:rPr>
+          <w:color w:val="FF0000"/>
+        </w:rPr>
+        <w:t>or</w:t>
       </w:r>
       <w:r>
         <w:rPr>
           <w:color w:val="FFC000"/>
         </w:rPr>
-        <w:t>{</w:t>
-      </w:r>
-      <w:proofErr w:type="gramEnd"/>
+        <w:t xml:space="preserve"> </w:t>
+      </w:r>
+      <w:r>
+        <w:rPr>
+          <w:color w:val="FF0000"/>
+        </w:rPr>
+        <w:t>(</w:t>
+      </w:r>
       <w:r>
         <w:rPr>
           <w:color w:val="FFC000"/>
         </w:rPr>
-        <w:t>% else %}</w:t>
+        <w:t xml:space="preserve">user_need in (‘answer custody’, ‘answer divorce’) and </w:t>
+      </w:r>
+      <w:proofErr w:type="spellStart"/>
+      <w:r>
+        <w:rPr>
+          <w:color w:val="FFC000"/>
+        </w:rPr>
+        <w:t>type_of_resonse.all_false</w:t>
+      </w:r>
+      <w:proofErr w:type="spellEnd"/>
+      <w:r>
+        <w:rPr>
+          <w:color w:val="FFC000"/>
+        </w:rPr>
+        <w:t>()</w:t>
+      </w:r>
+      <w:r>
+        <w:rPr>
+          <w:color w:val="FF0000"/>
+        </w:rPr>
+        <w:t>)</w:t>
+      </w:r>
+      <w:r>
+        <w:rPr>
+          <w:color w:val="FFC000"/>
+        </w:rPr>
+        <w:t xml:space="preserve"> </w:t>
+      </w:r>
+      <w:r>
+        <w:rPr>
+          <w:color w:val="FFC000"/>
+        </w:rPr>
+        <w:t>%}</w:t>
+      </w:r>
+      <w:r>
+        <w:t>If you want to try to reach an agreement about the Parenting Plan, your options may be limited if there has been domestic violence.</w:t>
+      </w:r>
+    </w:p>
+    <w:p>
+      <w:pPr>
+        <w:pStyle w:val="Heading3"/>
+      </w:pPr>
+      <w:r>
+        <w:t>Your Parenting Plan agreement may be limited if there is domestic violence</w:t>
+      </w:r>
+      <w:r>
+        <w:rPr>
+          <w:color w:val="FFC000"/>
+        </w:rPr>
+        <w:t>{% else %}</w:t>
       </w:r>
       <w:r>
         <w:t xml:space="preserve">How domestic violence affects </w:t>
@@ -543,7 +437,11 @@
         <w:ind w:left="540"/>
       </w:pPr>
       <w:r>
-        <w:t>The law presumes that a parent with a "history of domestic violence" not get custody or unsupervised visitation unless they meet certain requirements. These may include completing a batterer's intervention or substance abuse treatment program.</w:t>
+        <w:t xml:space="preserve">The law presumes that a parent with a "history of domestic violence" not get custody or unsupervised visitation unless they meet certain requirements. These </w:t>
+      </w:r>
+      <w:r>
+        <w:lastRenderedPageBreak/>
+        <w:t>may include completing a batterer's intervention or substance abuse treatment program.</w:t>
       </w:r>
     </w:p>
     <w:p>
@@ -556,7 +454,6 @@
         <w:ind w:left="360"/>
       </w:pPr>
       <w:r>
-        <w:lastRenderedPageBreak/>
         <w:t>A "history of domestic violence" is defined by the law as either one incident of domestic violence that caused serious physical injury, or more than one incident. The parent's domestic violence behavior needs to fit under one of the domestic violence crimes in the law. There does not have to be a protective order or criminal case for the court to find a parent has a history of domestic violence. The court can find domestic violence based on one parent's testimony.</w:t>
       </w:r>
     </w:p>
@@ -568,63 +465,7 @@
         <w:rPr>
           <w:color w:val="FFC000"/>
         </w:rPr>
-        <w:t>{% if ((user_need == 'answer custody' and (type_of_response.all_true('</w:t>
-      </w:r>
-      <w:proofErr w:type="spellStart"/>
-      <w:r>
-        <w:rPr>
-          <w:color w:val="FFC000"/>
-        </w:rPr>
-        <w:t>ak</w:t>
-      </w:r>
-      <w:proofErr w:type="spellEnd"/>
-      <w:r>
-        <w:rPr>
-          <w:color w:val="FFC000"/>
-        </w:rPr>
-        <w:t xml:space="preserve"> custody case', exclusive=True) or type_of_response.all_true('</w:t>
-      </w:r>
-      <w:proofErr w:type="spellStart"/>
-      <w:r>
-        <w:rPr>
-          <w:color w:val="FFC000"/>
-        </w:rPr>
-        <w:t>ak</w:t>
-      </w:r>
-      <w:proofErr w:type="spellEnd"/>
-      <w:r>
-        <w:rPr>
-          <w:color w:val="FFC000"/>
-        </w:rPr>
-        <w:t xml:space="preserve"> custody case', 'improper service', exclusive=True))) or (user_need == 'answer divorce' and (type_of_response.all_true('</w:t>
-      </w:r>
-      <w:proofErr w:type="spellStart"/>
-      <w:r>
-        <w:rPr>
-          <w:color w:val="FFC000"/>
-        </w:rPr>
-        <w:t>ak</w:t>
-      </w:r>
-      <w:proofErr w:type="spellEnd"/>
-      <w:r>
-        <w:rPr>
-          <w:color w:val="FFC000"/>
-        </w:rPr>
-        <w:t xml:space="preserve"> divorce case', exclusive=True) or type_of_response.all_true('</w:t>
-      </w:r>
-      <w:proofErr w:type="spellStart"/>
-      <w:r>
-        <w:rPr>
-          <w:color w:val="FFC000"/>
-        </w:rPr>
-        <w:t>ak</w:t>
-      </w:r>
-      <w:proofErr w:type="spellEnd"/>
-      <w:r>
-        <w:rPr>
-          <w:color w:val="FFC000"/>
-        </w:rPr>
-        <w:t xml:space="preserve"> divorce case', 'improper service', exclusive=True)) and (case_type == 'divorce' or (case_type == 'legal separation' and want_legal_separation == 'yes')))) and (response_to_complaint in ('agree', 'some') or (response_to_complaint == 'none' and </w:t>
+        <w:t xml:space="preserve">{% if ((user_need == 'answer custody' and (type_of_response.all_true('ak custody case', exclusive=True) or type_of_response.all_true('ak custody case', 'improper service', exclusive=True))) or (user_need == 'answer divorce' and (type_of_response.all_true('ak divorce case', exclusive=True) or type_of_response.all_true('ak divorce case', 'improper service', exclusive=True)) and (case_type == 'divorce' or (case_type == 'legal separation' and want_legal_separation == 'yes')))) and (response_to_complaint in ('agree', 'some') or (response_to_complaint == 'none' and </w:t>
       </w:r>
       <w:proofErr w:type="spellStart"/>
       <w:r>
@@ -664,15 +505,7 @@
         <w:pStyle w:val="Body"/>
       </w:pPr>
       <w:r>
-        <w:t xml:space="preserve">If you think </w:t>
-      </w:r>
-      <w:proofErr w:type="gramStart"/>
-      <w:r>
-        <w:t>{{ other</w:t>
-      </w:r>
-      <w:proofErr w:type="gramEnd"/>
-      <w:r>
-        <w:t>_party_in_case }} should not have any contact with your children, you need to convince the judge that it is in the children's best interest.</w:t>
+        <w:t>If you think {{ other_party_in_case }} should not have any contact with your children, you need to convince the judge that it is in the children's best interest.</w:t>
       </w:r>
     </w:p>
     <w:p>
@@ -680,18 +513,22 @@
         <w:pStyle w:val="Body"/>
       </w:pPr>
       <w:r>
-        <w:t xml:space="preserve">Generally, it is unusual for a judge in a </w:t>
-      </w:r>
-      <w:proofErr w:type="gramStart"/>
-      <w:r>
-        <w:t>{{ case</w:t>
-      </w:r>
-      <w:proofErr w:type="gramEnd"/>
-      <w:r>
-        <w:t>_type }}</w:t>
-      </w:r>
-      <w:r>
-        <w:t xml:space="preserve"> case to decide that a parent cannot see their children. Research shows it is important for children to have a relationship with both parents, if it can happen in a safe manner.</w:t>
+        <w:t xml:space="preserve">Generally, it is unusual for a judge in </w:t>
+      </w:r>
+      <w:r>
+        <w:t xml:space="preserve">a </w:t>
+      </w:r>
+      <w:r>
+        <w:t>{</w:t>
+      </w:r>
+      <w:r>
+        <w:t>{ "custody" if user_need in('custody', 'answer custody') else "divorce or legal separation" }</w:t>
+      </w:r>
+      <w:r>
+        <w:t xml:space="preserve">} </w:t>
+      </w:r>
+      <w:r>
+        <w:t>case to decide that a parent cannot see their children. Research shows it is important for children to have a relationship with both parents, if it can happen in a safe manner.</w:t>
       </w:r>
     </w:p>
     <w:p>
@@ -710,70 +547,14 @@
         <w:rPr>
           <w:color w:val="FFC000"/>
         </w:rPr>
-        <w:t>{% if ((user_need == 'answer custody' and (type_of_response.all_true('</w:t>
-      </w:r>
-      <w:proofErr w:type="spellStart"/>
-      <w:r>
-        <w:rPr>
-          <w:color w:val="FFC000"/>
-        </w:rPr>
-        <w:t>ak</w:t>
-      </w:r>
-      <w:proofErr w:type="spellEnd"/>
-      <w:r>
-        <w:rPr>
-          <w:color w:val="FFC000"/>
-        </w:rPr>
-        <w:t xml:space="preserve"> custody case', exclusive=True) or type_of_response.all_true('</w:t>
-      </w:r>
-      <w:proofErr w:type="spellStart"/>
-      <w:r>
-        <w:rPr>
-          <w:color w:val="FFC000"/>
-        </w:rPr>
-        <w:t>ak</w:t>
-      </w:r>
-      <w:proofErr w:type="spellEnd"/>
-      <w:r>
-        <w:rPr>
-          <w:color w:val="FFC000"/>
-        </w:rPr>
-        <w:t xml:space="preserve"> custody case', 'improper service', exclusive=True))) or (user_need == 'answer divorce' and (type_of_response.all_true('</w:t>
-      </w:r>
-      <w:proofErr w:type="spellStart"/>
-      <w:r>
-        <w:rPr>
-          <w:color w:val="FFC000"/>
-        </w:rPr>
-        <w:t>ak</w:t>
-      </w:r>
-      <w:proofErr w:type="spellEnd"/>
-      <w:r>
-        <w:rPr>
-          <w:color w:val="FFC000"/>
-        </w:rPr>
-        <w:t xml:space="preserve"> divorce case', exclusive=True) or </w:t>
+        <w:t xml:space="preserve">{% if ((user_need == 'answer custody' and (type_of_response.all_true('ak custody case', exclusive=True) or type_of_response.all_true('ak custody case', 'improper service', </w:t>
       </w:r>
       <w:r>
         <w:rPr>
           <w:color w:val="FFC000"/>
         </w:rPr>
         <w:lastRenderedPageBreak/>
-        <w:t>type_of_response.all_true('</w:t>
-      </w:r>
-      <w:proofErr w:type="spellStart"/>
-      <w:r>
-        <w:rPr>
-          <w:color w:val="FFC000"/>
-        </w:rPr>
-        <w:t>ak</w:t>
-      </w:r>
-      <w:proofErr w:type="spellEnd"/>
-      <w:r>
-        <w:rPr>
-          <w:color w:val="FFC000"/>
-        </w:rPr>
-        <w:t xml:space="preserve"> divorce case', 'improper service', exclusive=True)) and (case_type == 'divorce' or (case_type == 'legal separation' and want_legal_separation == 'yes')))) and (response_to_complaint in ('agree', 'some') or (response_to_complaint == 'none' and </w:t>
+        <w:t xml:space="preserve">exclusive=True))) or (user_need == 'answer divorce' and (type_of_response.all_true('ak divorce case', exclusive=True) or type_of_response.all_true('ak divorce case', 'improper service', exclusive=True)) and (case_type == 'divorce' or (case_type == 'legal separation' and want_legal_separation == 'yes')))) and (response_to_complaint in ('agree', 'some') or (response_to_complaint == 'none' and </w:t>
       </w:r>
       <w:proofErr w:type="spellStart"/>
       <w:r>
@@ -812,23 +593,7 @@
       </w:r>
       <w:proofErr w:type="gramEnd"/>
       <w:r>
-        <w:t xml:space="preserve"> you file and when you talk in court. If you have concerns for the children's safety when in the care of </w:t>
-      </w:r>
-      <w:proofErr w:type="gramStart"/>
-      <w:r>
-        <w:t>{{ other</w:t>
-      </w:r>
-      <w:proofErr w:type="gramEnd"/>
-      <w:r>
-        <w:t xml:space="preserve">_party_in_case }}, or for yourself when interacting with {{ other_party_in_case }}, describe them to the judge. If the judge is going to allow </w:t>
-      </w:r>
-      <w:proofErr w:type="gramStart"/>
-      <w:r>
-        <w:t>{{ other</w:t>
-      </w:r>
-      <w:proofErr w:type="gramEnd"/>
-      <w:r>
-        <w:t>_party_in_case }} to have parenting time (visitation) with the children, you can suggest ways to address your concerns. Some options include:</w:t>
+        <w:t xml:space="preserve"> you file and when you talk in court. If you have concerns for the children's safety when in the care of {{ other_party_in_case }}, or for yourself when interacting with {{ other_party_in_case }}, describe them to the judge. If the judge is going to allow {{ other_party_in_case }} to have parenting time (visitation) with the children, you can suggest ways to address your concerns. Some options include:</w:t>
       </w:r>
     </w:p>
     <w:p>
@@ -992,15 +757,7 @@
         <w:pStyle w:val="Body"/>
       </w:pPr>
       <w:r>
-        <w:t xml:space="preserve">If you think you or your children's health, safety, or liberty would be harmed by providing the information on the **Child Custody Jurisdiction Affidavit, DR-150** to </w:t>
-      </w:r>
-      <w:proofErr w:type="gramStart"/>
-      <w:r>
-        <w:t>{{ other</w:t>
-      </w:r>
-      <w:proofErr w:type="gramEnd"/>
-      <w:r>
-        <w:t>_party_in_case }}:</w:t>
+        <w:t>If you think you or your children's health, safety, or liberty would be harmed by providing the information on the **Child Custody Jurisdiction Affidavit, DR-150** to {{ other_party_in_case }}:</w:t>
       </w:r>
     </w:p>
     <w:p>
@@ -1013,15 +770,7 @@
         <w:ind w:left="360"/>
       </w:pPr>
       <w:r>
-        <w:t xml:space="preserve">Do not give </w:t>
-      </w:r>
-      <w:proofErr w:type="gramStart"/>
-      <w:r>
-        <w:t>{{ other</w:t>
-      </w:r>
-      <w:proofErr w:type="gramEnd"/>
-      <w:r>
-        <w:t xml:space="preserve">_party_in_case }} a copy of the completed </w:t>
+        <w:t xml:space="preserve">Do not give {{ other_party_in_case }} a copy of the completed </w:t>
       </w:r>
       <w:r>
         <w:rPr>
@@ -1044,6 +793,7 @@
         <w:ind w:left="360"/>
       </w:pPr>
       <w:r>
+        <w:lastRenderedPageBreak/>
         <w:t xml:space="preserve">File </w:t>
       </w:r>
       <w:bookmarkStart w:id="0" w:name="_Hlk226024791"/>
@@ -1075,7 +825,6 @@
         <w:pStyle w:val="Heading3"/>
       </w:pPr>
       <w:r>
-        <w:lastRenderedPageBreak/>
         <w:t>Links in this step</w:t>
       </w:r>
     </w:p>

</xml_diff>

<commit_message>
more typos - this time in answer_domestic_violence_content
</commit_message>
<xml_diff>
--- a/docassemble/AKA2JBranding/data/templates/answer_domestic_violence_content.docx
+++ b/docassemble/AKA2JBranding/data/templates/answer_domestic_violence_content.docx
@@ -363,21 +363,19 @@
         <w:rPr>
           <w:color w:val="FFC000"/>
         </w:rPr>
-        <w:t xml:space="preserve">user_need in (‘answer custody’, ‘answer divorce’) and </w:t>
-      </w:r>
-      <w:proofErr w:type="spellStart"/>
+        <w:t>user_need in (‘answer custody’, ‘answer divorce’) and type_of_res</w:t>
+      </w:r>
       <w:r>
         <w:rPr>
           <w:color w:val="FFC000"/>
         </w:rPr>
-        <w:t>type_of_resonse.all_false</w:t>
-      </w:r>
-      <w:proofErr w:type="spellEnd"/>
+        <w:t>p</w:t>
+      </w:r>
       <w:r>
         <w:rPr>
           <w:color w:val="FFC000"/>
         </w:rPr>
-        <w:t>()</w:t>
+        <w:t>onse.all_false()</w:t>
       </w:r>
       <w:r>
         <w:rPr>
@@ -585,15 +583,7 @@
         <w:pStyle w:val="Body"/>
       </w:pPr>
       <w:r>
-        <w:t xml:space="preserve">The judge will only know about your domestic violence concerns if you state them in the </w:t>
-      </w:r>
-      <w:proofErr w:type="gramStart"/>
-      <w:r>
-        <w:t>documents</w:t>
-      </w:r>
-      <w:proofErr w:type="gramEnd"/>
-      <w:r>
-        <w:t xml:space="preserve"> you file and when you talk in court. If you have concerns for the children's safety when in the care of {{ other_party_in_case }}, or for yourself when interacting with {{ other_party_in_case }}, describe them to the judge. If the judge is going to allow {{ other_party_in_case }} to have parenting time (visitation) with the children, you can suggest ways to address your concerns. Some options include:</w:t>
+        <w:t>The judge will only know about your domestic violence concerns if you state them in the documents you file and when you talk in court. If you have concerns for the children's safety when in the care of {{ other_party_in_case }}, or for yourself when interacting with {{ other_party_in_case }}, describe them to the judge. If the judge is going to allow {{ other_party_in_case }} to have parenting time (visitation) with the children, you can suggest ways to address your concerns. Some options include:</w:t>
       </w:r>
     </w:p>
     <w:p>

</xml_diff>

<commit_message>
more edits to answer_domestic_violence_content
</commit_message>
<xml_diff>
--- a/docassemble/AKA2JBranding/data/templates/answer_domestic_violence_content.docx
+++ b/docassemble/AKA2JBranding/data/templates/answer_domestic_violence_content.docx
@@ -289,7 +289,31 @@
         <w:rPr>
           <w:color w:val="FF0000"/>
         </w:rPr>
-        <w:t>{% if user_need in ('custody', 'answer custody') or (user_need in ('divorce', 'answer divorce') and minor_children or (not minor_children and wife_is_pregnant in ('husband', 'not husband'))) %}</w:t>
+        <w:t xml:space="preserve">{% if user_need in ('custody', 'answer custody') or (user_need in ('divorce', 'answer divorce') and </w:t>
+      </w:r>
+      <w:r>
+        <w:rPr>
+          <w:color w:val="FF0000"/>
+        </w:rPr>
+        <w:t>(</w:t>
+      </w:r>
+      <w:r>
+        <w:rPr>
+          <w:color w:val="FF0000"/>
+        </w:rPr>
+        <w:t>minor_children or (not minor_children and wife_is_pregnant in ('husband', 'not husband'))</w:t>
+      </w:r>
+      <w:r>
+        <w:rPr>
+          <w:color w:val="FF0000"/>
+        </w:rPr>
+        <w:t>)</w:t>
+      </w:r>
+      <w:r>
+        <w:rPr>
+          <w:color w:val="FF0000"/>
+        </w:rPr>
+        <w:t>) %}</w:t>
       </w:r>
       <w:r>
         <w:rPr>
@@ -583,7 +607,15 @@
         <w:pStyle w:val="Body"/>
       </w:pPr>
       <w:r>
-        <w:t>The judge will only know about your domestic violence concerns if you state them in the documents you file and when you talk in court. If you have concerns for the children's safety when in the care of {{ other_party_in_case }}, or for yourself when interacting with {{ other_party_in_case }}, describe them to the judge. If the judge is going to allow {{ other_party_in_case }} to have parenting time (visitation) with the children, you can suggest ways to address your concerns. Some options include:</w:t>
+        <w:t xml:space="preserve">The judge will only know about your domestic violence concerns if you state them in the </w:t>
+      </w:r>
+      <w:proofErr w:type="gramStart"/>
+      <w:r>
+        <w:t>documents</w:t>
+      </w:r>
+      <w:proofErr w:type="gramEnd"/>
+      <w:r>
+        <w:t xml:space="preserve"> you file and when you talk in court. If you have concerns for the children's safety when in the care of {{ other_party_in_case }}, or for yourself when interacting with {{ other_party_in_case }}, describe them to the judge. If the judge is going to allow {{ other_party_in_case }} to have parenting time (visitation) with the children, you can suggest ways to address your concerns. Some options include:</w:t>
       </w:r>
     </w:p>
     <w:p>
@@ -747,7 +779,17 @@
         <w:pStyle w:val="Body"/>
       </w:pPr>
       <w:r>
-        <w:t>If you think you or your children's health, safety, or liberty would be harmed by providing the information on the **Child Custody Jurisdiction Affidavit, DR-150** to {{ other_party_in_case }}:</w:t>
+        <w:t xml:space="preserve">If you think you or your children's health, safety, or liberty would be harmed by providing the information on the </w:t>
+      </w:r>
+      <w:r>
+        <w:rPr>
+          <w:b/>
+          <w:bCs/>
+        </w:rPr>
+        <w:t>Child Custody Jurisdiction Affidavit, DR-150</w:t>
+      </w:r>
+      <w:r>
+        <w:t xml:space="preserve"> to {{ other_party_in_case }}:</w:t>
       </w:r>
     </w:p>
     <w:p>
@@ -946,7 +988,31 @@
         <w:rPr>
           <w:color w:val="FF0000"/>
         </w:rPr>
-        <w:t>{% if user_need in ('custody', 'answer custody') or (user_need in ('divorce', 'answer divorce') and minor_children or (not minor_children and wife_is_pregnant in ('husband', 'not husband'))) %}</w:t>
+        <w:t xml:space="preserve">{% if user_need in ('custody', 'answer custody') or (user_need in ('divorce', 'answer divorce') and </w:t>
+      </w:r>
+      <w:r>
+        <w:rPr>
+          <w:color w:val="FF0000"/>
+        </w:rPr>
+        <w:t>(</w:t>
+      </w:r>
+      <w:r>
+        <w:rPr>
+          <w:color w:val="FF0000"/>
+        </w:rPr>
+        <w:t>minor_children or (not minor_children and wife_is_pregnant in ('husband', 'not husband'))</w:t>
+      </w:r>
+      <w:r>
+        <w:rPr>
+          <w:color w:val="FF0000"/>
+        </w:rPr>
+        <w:t>)</w:t>
+      </w:r>
+      <w:r>
+        <w:rPr>
+          <w:color w:val="FF0000"/>
+        </w:rPr>
+        <w:t>) %}</w:t>
       </w:r>
     </w:p>
     <w:p>

</xml_diff>

<commit_message>
fixed want_help_to_agree_content.docx and checked answer_domestic_violence_content.docx
</commit_message>
<xml_diff>
--- a/docassemble/AKA2JBranding/data/templates/answer_domestic_violence_content.docx
+++ b/docassemble/AKA2JBranding/data/templates/answer_domestic_violence_content.docx
@@ -18,34 +18,121 @@
         <w:rPr>
           <w:color w:val="FF0000"/>
         </w:rPr>
-        <w:t>{% if user_need == 'custody' %}</w:t>
-      </w:r>
-      <w:r>
-        <w:t>People who have experienced domestic violence can be at greater risk when they start a court case</w:t>
+        <w:t>{%</w:t>
       </w:r>
       <w:r>
         <w:rPr>
           <w:color w:val="FF0000"/>
         </w:rPr>
-        <w:t>.{% elif user_need == 'divorce' %}</w:t>
-      </w:r>
-      <w:r>
+        <w:t>p</w:t>
+      </w:r>
+      <w:r>
+        <w:rPr>
+          <w:color w:val="FF0000"/>
+        </w:rPr>
+        <w:t xml:space="preserve"> if user_need == 'custody' %}</w:t>
+      </w:r>
+    </w:p>
+    <w:p>
+      <w:pPr>
+        <w:pStyle w:val="Body"/>
+      </w:pPr>
+      <w:r>
+        <w:rPr>
+          <w:color w:val="FF0000"/>
+        </w:rPr>
+        <w:t>People who have experienced domestic violence can be at greater risk when they start a court case.</w:t>
+      </w:r>
+    </w:p>
+    <w:p>
+      <w:pPr>
+        <w:pStyle w:val="Body"/>
+      </w:pPr>
+      <w:r>
+        <w:rPr>
+          <w:color w:val="FF0000"/>
+        </w:rPr>
+        <w:t>{%</w:t>
+      </w:r>
+      <w:r>
+        <w:rPr>
+          <w:color w:val="FF0000"/>
+        </w:rPr>
+        <w:t>p</w:t>
+      </w:r>
+      <w:r>
+        <w:rPr>
+          <w:color w:val="FF0000"/>
+        </w:rPr>
+        <w:t xml:space="preserve"> elif user_need == 'divorce' %}</w:t>
+      </w:r>
+    </w:p>
+    <w:p>
+      <w:pPr>
+        <w:pStyle w:val="Body"/>
+      </w:pPr>
+      <w:r>
+        <w:rPr>
+          <w:color w:val="FF0000"/>
+        </w:rPr>
         <w:t>People who have experienced domestic violence can be at greater risk when they separate from their spouse or start a court case to end their marriage.</w:t>
       </w:r>
+    </w:p>
+    <w:p>
+      <w:pPr>
+        <w:pStyle w:val="Body"/>
+      </w:pPr>
       <w:r>
         <w:rPr>
           <w:color w:val="FF0000"/>
         </w:rPr>
-        <w:t>{% elif user_need in('answer custody', 'answer divorce') %}</w:t>
-      </w:r>
-      <w:r>
+        <w:t>{%</w:t>
+      </w:r>
+      <w:r>
+        <w:rPr>
+          <w:color w:val="FF0000"/>
+        </w:rPr>
+        <w:t>p</w:t>
+      </w:r>
+      <w:r>
+        <w:rPr>
+          <w:color w:val="FF0000"/>
+        </w:rPr>
+        <w:t xml:space="preserve"> elif user_need in('answer custody', 'answer divorce') %}</w:t>
+      </w:r>
+    </w:p>
+    <w:p>
+      <w:pPr>
+        <w:pStyle w:val="Body"/>
+      </w:pPr>
+      <w:r>
+        <w:rPr>
+          <w:color w:val="FF0000"/>
+        </w:rPr>
         <w:t>People who have experienced domestic violence can be at risk during a court case.</w:t>
       </w:r>
+    </w:p>
+    <w:p>
+      <w:pPr>
+        <w:pStyle w:val="Body"/>
+      </w:pPr>
       <w:r>
         <w:rPr>
           <w:color w:val="FF0000"/>
         </w:rPr>
-        <w:t>{% endif %}</w:t>
+        <w:t>{%</w:t>
+      </w:r>
+      <w:r>
+        <w:rPr>
+          <w:color w:val="FF0000"/>
+        </w:rPr>
+        <w:t>p</w:t>
+      </w:r>
+      <w:r>
+        <w:rPr>
+          <w:color w:val="FF0000"/>
+        </w:rPr>
+        <w:t xml:space="preserve"> endif %}</w:t>
       </w:r>
     </w:p>
     <w:p>
@@ -73,7 +160,7 @@
         </w:numPr>
         <w:ind w:left="450"/>
       </w:pPr>
-      <w:hyperlink r:id="rId5" w:history="1">
+      <w:hyperlink r:id="rId7" w:history="1">
         <w:r>
           <w:rPr>
             <w:rStyle w:val="Hyperlink"/>
@@ -96,9 +183,12 @@
         <w:ind w:left="450"/>
       </w:pPr>
       <w:r>
-        <w:t xml:space="preserve">You can get information about asking the court for a protective order by answering more questions. See the Court Guide Action Plan: </w:t>
-      </w:r>
-      <w:hyperlink r:id="rId6" w:history="1">
+        <w:t>You can get information about asking the court for a protective order by answering more questions. See the Court Guide Action Plan:</w:t>
+      </w:r>
+      <w:r>
+        <w:t xml:space="preserve"> </w:t>
+      </w:r>
+      <w:hyperlink r:id="rId8" w:history="1">
         <w:r>
           <w:rPr>
             <w:rStyle w:val="Hyperlink"/>
@@ -108,6 +198,10 @@
         </w:r>
       </w:hyperlink>
       <w:r>
+        <w:rPr>
+          <w:rStyle w:val="Hyperlink"/>
+          <w:spacing w:val="0"/>
+        </w:rPr>
         <w:t>.</w:t>
       </w:r>
     </w:p>
@@ -121,9 +215,12 @@
         <w:ind w:left="450"/>
       </w:pPr>
       <w:r>
-        <w:t xml:space="preserve">See if you qualify for </w:t>
-      </w:r>
-      <w:hyperlink r:id="rId7" w:history="1">
+        <w:t>See if you qualify for</w:t>
+      </w:r>
+      <w:r>
+        <w:t xml:space="preserve"> </w:t>
+      </w:r>
+      <w:hyperlink r:id="rId9" w:history="1">
         <w:r>
           <w:rPr>
             <w:rStyle w:val="Hyperlink"/>
@@ -133,9 +230,21 @@
         </w:r>
       </w:hyperlink>
       <w:r>
-        <w:t xml:space="preserve"> or </w:t>
-      </w:r>
-      <w:hyperlink r:id="rId8" w:history="1">
+        <w:rPr>
+          <w:rStyle w:val="Hyperlink"/>
+          <w:spacing w:val="0"/>
+        </w:rPr>
+        <w:t xml:space="preserve"> </w:t>
+      </w:r>
+      <w:r>
+        <w:rPr>
+          <w:rStyle w:val="Hyperlink"/>
+          <w:color w:val="auto"/>
+          <w:spacing w:val="0"/>
+        </w:rPr>
+        <w:t xml:space="preserve">or </w:t>
+      </w:r>
+      <w:hyperlink r:id="rId10" w:history="1">
         <w:r>
           <w:rPr>
             <w:rStyle w:val="Hyperlink"/>
@@ -145,6 +254,10 @@
         </w:r>
       </w:hyperlink>
       <w:r>
+        <w:rPr>
+          <w:rStyle w:val="Hyperlink"/>
+          <w:spacing w:val="0"/>
+        </w:rPr>
         <w:t>.</w:t>
       </w:r>
     </w:p>
@@ -156,27 +269,42 @@
         <w:rPr>
           <w:color w:val="FF0000"/>
         </w:rPr>
-        <w:t xml:space="preserve">{% if ((user_need == 'answer custody' and (type_of_response.all_true('ak custody case', exclusive=True) or type_of_response.all_true('ak custody case', 'improper service', exclusive=True))) or (user_need == 'answer divorce' and (type_of_response.all_true('ak divorce case', exclusive=True) or type_of_response.all_true('ak divorce case', 'improper service', exclusive=True)) and (case_type == 'divorce' or (case_type == 'legal separation' and want_legal_separation == 'yes')))) and (response_to_complaint in ('agree', 'some') or (response_to_complaint == 'none' and </w:t>
-      </w:r>
-      <w:proofErr w:type="spellStart"/>
+        <w:t>{%</w:t>
+      </w:r>
       <w:r>
         <w:rPr>
           <w:color w:val="FF0000"/>
         </w:rPr>
-        <w:t>want_help_to_agree</w:t>
-      </w:r>
-      <w:proofErr w:type="spellEnd"/>
+        <w:t>p</w:t>
+      </w:r>
       <w:r>
         <w:rPr>
           <w:color w:val="FF0000"/>
         </w:rPr>
-        <w:t>)) %}</w:t>
-      </w:r>
+        <w:t xml:space="preserve"> if ((user_need == 'answer custody' and (type_of_response.all_true('ak custody case', exclusive=True) or type_of_response.all_true('ak custody case', 'improper service', exclusive=True))) or (user_need == 'answer divorce' and (type_of_response.all_true('ak divorce case', exclusive=True) or type_of_response.all_true('ak divorce case', 'improper service', exclusive=True)) and (case_type == 'divorce' or (case_type == 'legal separation' and want_legal_separation == 'yes')))) and (response_to_complaint in ('agree', 'some') or (response_to_complaint == 'none' and want_help_to_agree)) %}</w:t>
+      </w:r>
+    </w:p>
+    <w:p>
+      <w:pPr>
+        <w:pStyle w:val="Body"/>
+      </w:pPr>
       <w:r>
         <w:rPr>
           <w:color w:val="FFC000"/>
         </w:rPr>
-        <w:t>{% if user_need == 'answer custody' %}</w:t>
+        <w:t>{%</w:t>
+      </w:r>
+      <w:r>
+        <w:rPr>
+          <w:color w:val="FFC000"/>
+        </w:rPr>
+        <w:t>p</w:t>
+      </w:r>
+      <w:r>
+        <w:rPr>
+          <w:color w:val="FFC000"/>
+        </w:rPr>
+        <w:t xml:space="preserve"> if user_need == 'answer custody' %}</w:t>
       </w:r>
       <w:r>
         <w:t>However, some parents in a relationship that includes domestic violence are comfortable reaching an agreement about a Parenting Plan for a variety of reasons.</w:t>
@@ -195,6 +323,7 @@
         <w:pStyle w:val="Body"/>
       </w:pPr>
       <w:r>
+        <w:lastRenderedPageBreak/>
         <w:t>If the domestic violence does make a parent uncomfortable or afraid, provisions are used to make the process of trying to reach an agreement feel safer (having a support person present, having a mediator or a trusted third person help with discussions, not meeting in-person, meeting in different rooms, or talking about an agreement through email, text or telephone).</w:t>
       </w:r>
     </w:p>
@@ -203,250 +332,386 @@
         <w:pStyle w:val="Body"/>
       </w:pPr>
       <w:r>
-        <w:t xml:space="preserve">Sometimes, one parent's main goal is to finish the case and be done in a safe manner so they are willing to give up some things in the agreement that they may be entitled to </w:t>
-      </w:r>
-      <w:r>
+        <w:t>Sometimes, one parent's main goal is to finish the case and be done in a safe manner so they are willing to give up some things in the agreement that they may be entitled to under the law</w:t>
+      </w:r>
+      <w:r>
+        <w:t>.</w:t>
+      </w:r>
+    </w:p>
+    <w:p>
+      <w:pPr>
+        <w:pStyle w:val="Body"/>
+      </w:pPr>
+      <w:r>
+        <w:rPr>
+          <w:color w:val="FFC000"/>
+        </w:rPr>
+        <w:t>{%</w:t>
+      </w:r>
+      <w:r>
+        <w:rPr>
+          <w:color w:val="FFC000"/>
+        </w:rPr>
+        <w:t>p</w:t>
+      </w:r>
+      <w:r>
+        <w:rPr>
+          <w:color w:val="FFC000"/>
+        </w:rPr>
+        <w:t xml:space="preserve"> elif user_need == 'answer divorce' %}</w:t>
+      </w:r>
+    </w:p>
+    <w:p>
+      <w:pPr>
+        <w:pStyle w:val="Body"/>
+      </w:pPr>
+      <w:r>
+        <w:t xml:space="preserve">However, some people in a marriage with domestic violence are comfortable reaching an agreement about </w:t>
+      </w:r>
+      <w:r>
+        <w:rPr>
+          <w:color w:val="92D050"/>
+        </w:rPr>
+        <w:t>{% if minor_children or (not minor_children and wife_is_pregnant in ('husband', 'not husband')) %}</w:t>
+      </w:r>
+      <w:r>
+        <w:t xml:space="preserve">a Parenting Plan and </w:t>
+      </w:r>
+      <w:r>
+        <w:rPr>
+          <w:color w:val="92D050"/>
+        </w:rPr>
+        <w:t>{% endif %}</w:t>
+      </w:r>
+      <w:r>
+        <w:t>dividing marital property and debt for a variety of reasons.</w:t>
+      </w:r>
+    </w:p>
+    <w:p>
+      <w:pPr>
+        <w:pStyle w:val="Body"/>
+      </w:pPr>
+      <w:r>
+        <w:t>Sometimes, domestic violence does not make either spouse uncomfortable or afraid to ask for what they want in the {{ "Parenting Plan or " if minor_children else "" }}property &amp; debt division.</w:t>
+      </w:r>
+    </w:p>
+    <w:p>
+      <w:pPr>
+        <w:pStyle w:val="Body"/>
+      </w:pPr>
+      <w:r>
+        <w:t>If the domestic violence does make a spouse uncomfortable or afraid, provisions are used to make the process of trying to reach an agreement feel safer (having a support person present, having a mediator or a trusted third person help with discussions, not meeting in-person, meeting in different rooms, or talking about an agreement through email, text or telephone).</w:t>
+      </w:r>
+    </w:p>
+    <w:p>
+      <w:pPr>
+        <w:pStyle w:val="Body"/>
+      </w:pPr>
+      <w:r>
+        <w:t>Sometimes, one spouse's main goal is to finish the case and be done in a safe manner so they are willing to give up some things in the agreement that they may be entitled to under the law.</w:t>
+      </w:r>
+    </w:p>
+    <w:p>
+      <w:pPr>
+        <w:pStyle w:val="Body"/>
+      </w:pPr>
+      <w:r>
+        <w:rPr>
+          <w:color w:val="FFC000"/>
+        </w:rPr>
+        <w:t>{%</w:t>
+      </w:r>
+      <w:r>
+        <w:rPr>
+          <w:color w:val="FFC000"/>
+        </w:rPr>
+        <w:t>p</w:t>
+      </w:r>
+      <w:r>
+        <w:rPr>
+          <w:color w:val="FFC000"/>
+        </w:rPr>
+        <w:t xml:space="preserve"> endif %}</w:t>
+      </w:r>
+    </w:p>
+    <w:p>
+      <w:pPr>
+        <w:pStyle w:val="Body"/>
+      </w:pPr>
+      <w:r>
+        <w:t>You can decide if you are comfortable trying to reach an agreement with {{ other_party_in_case }} based on the facts and circumstances of your case.</w:t>
+      </w:r>
+    </w:p>
+    <w:p>
+      <w:pPr>
+        <w:pStyle w:val="Body"/>
+      </w:pPr>
+      <w:r>
+        <w:rPr>
+          <w:color w:val="FF0000"/>
+        </w:rPr>
+        <w:t>{%</w:t>
+      </w:r>
+      <w:r>
+        <w:rPr>
+          <w:color w:val="FF0000"/>
+        </w:rPr>
+        <w:t>p</w:t>
+      </w:r>
+      <w:r>
+        <w:rPr>
+          <w:color w:val="FF0000"/>
+        </w:rPr>
+        <w:t xml:space="preserve"> endif %}</w:t>
+      </w:r>
+    </w:p>
+    <w:p>
+      <w:pPr>
+        <w:pStyle w:val="Body"/>
+      </w:pPr>
+      <w:r>
+        <w:rPr>
+          <w:color w:val="FF0000"/>
+        </w:rPr>
+        <w:t>{%</w:t>
+      </w:r>
+      <w:r>
+        <w:rPr>
+          <w:color w:val="FF0000"/>
+        </w:rPr>
+        <w:t>p</w:t>
+      </w:r>
+      <w:r>
+        <w:rPr>
+          <w:color w:val="FF0000"/>
+        </w:rPr>
+        <w:t xml:space="preserve"> if user_need in ('custody', 'answer custody') or (user_need in ('divorce', 'answer divorce') and minor_children or (not minor_children and wife_is_pregnant in ('husband', 'not husband'))) %}</w:t>
+      </w:r>
+    </w:p>
+    <w:p>
+      <w:pPr>
+        <w:pStyle w:val="Body"/>
+      </w:pPr>
+      <w:r>
+        <w:rPr>
+          <w:color w:val="FFC000"/>
+        </w:rPr>
+        <w:t>{%</w:t>
+      </w:r>
+      <w:r>
+        <w:rPr>
+          <w:color w:val="FFC000"/>
+        </w:rPr>
+        <w:t>p</w:t>
+      </w:r>
+      <w:r>
+        <w:rPr>
+          <w:color w:val="FFC000"/>
+        </w:rPr>
+        <w:t xml:space="preserve"> if (</w:t>
+      </w:r>
+      <w:r>
+        <w:rPr>
+          <w:color w:val="92D050"/>
+        </w:rPr>
+        <w:t>(</w:t>
+      </w:r>
+      <w:r>
+        <w:rPr>
+          <w:color w:val="FFC000"/>
+        </w:rPr>
+        <w:t xml:space="preserve">user_need == 'answer custody' and </w:t>
+      </w:r>
+      <w:r>
+        <w:rPr>
+          <w:color w:val="00B050"/>
+        </w:rPr>
+        <w:t>(</w:t>
+      </w:r>
+      <w:r>
+        <w:rPr>
+          <w:color w:val="FFC000"/>
+        </w:rPr>
+        <w:t>type_of_response.all_true('ak custody case', exclusive=True) or type_of_response.all_true('ak custody case', 'improper service', exclusive=True)</w:t>
+      </w:r>
+      <w:r>
+        <w:rPr>
+          <w:color w:val="00B050"/>
+        </w:rPr>
+        <w:t>)</w:t>
+      </w:r>
+      <w:r>
+        <w:rPr>
+          <w:color w:val="92D050"/>
+        </w:rPr>
+        <w:t>) or (</w:t>
+      </w:r>
+      <w:r>
+        <w:rPr>
+          <w:color w:val="FFC000"/>
+        </w:rPr>
+        <w:t xml:space="preserve">user_need == 'answer divorce' and </w:t>
+      </w:r>
+      <w:r>
+        <w:rPr>
+          <w:color w:val="00B050"/>
+        </w:rPr>
+        <w:t>(</w:t>
+      </w:r>
+      <w:r>
+        <w:rPr>
+          <w:color w:val="FFC000"/>
+        </w:rPr>
+        <w:t>type_of_response.all_true('ak divorce case', exclusive=True) or type_of_response.all_true('ak divorce case', 'improper service', exclusive=True)</w:t>
+      </w:r>
+      <w:r>
+        <w:rPr>
+          <w:color w:val="00B050"/>
+        </w:rPr>
+        <w:t xml:space="preserve">) and </w:t>
+      </w:r>
+      <w:r>
+        <w:rPr>
+          <w:color w:val="00B050"/>
+        </w:rPr>
         <w:lastRenderedPageBreak/>
-        <w:t>under the law</w:t>
+        <w:t>(</w:t>
       </w:r>
       <w:r>
         <w:rPr>
           <w:color w:val="FFC000"/>
         </w:rPr>
-        <w:t>.{% elif user_need == 'answer divorce' %}</w:t>
-      </w:r>
-      <w:r>
-        <w:t xml:space="preserve">However, some people in a marriage with domestic violence are comfortable reaching an agreement about </w:t>
+        <w:t xml:space="preserve">case_type == 'divorce' or </w:t>
+      </w:r>
+      <w:r>
+        <w:rPr>
+          <w:color w:val="00B0F0"/>
+        </w:rPr>
+        <w:t>(</w:t>
+      </w:r>
+      <w:r>
+        <w:rPr>
+          <w:color w:val="FFC000"/>
+        </w:rPr>
+        <w:t>case_type == 'legal separation' and want_legal_separation == 'yes'</w:t>
+      </w:r>
+      <w:r>
+        <w:rPr>
+          <w:color w:val="00B0F0"/>
+        </w:rPr>
+        <w:t>)</w:t>
+      </w:r>
+      <w:r>
+        <w:rPr>
+          <w:color w:val="00B050"/>
+        </w:rPr>
+        <w:t>)</w:t>
       </w:r>
       <w:r>
         <w:rPr>
           <w:color w:val="92D050"/>
         </w:rPr>
-        <w:t>{% if minor_children or (not minor_children and wife_is_pregnant in ('husband', 'not husband')) %}</w:t>
-      </w:r>
-      <w:r>
-        <w:t xml:space="preserve">a Parenting Plan and </w:t>
+        <w:t>)</w:t>
+      </w:r>
+      <w:r>
+        <w:rPr>
+          <w:color w:val="FFC000"/>
+        </w:rPr>
+        <w:t xml:space="preserve">) and (response_to_complaint in ('agree', 'some') </w:t>
       </w:r>
       <w:r>
         <w:rPr>
           <w:color w:val="92D050"/>
         </w:rPr>
-        <w:t>{% endif %}</w:t>
-      </w:r>
-      <w:r>
-        <w:t>dividing marital property and debt for a variety of reasons.</w:t>
-      </w:r>
-    </w:p>
-    <w:p>
-      <w:pPr>
-        <w:pStyle w:val="Body"/>
-      </w:pPr>
-      <w:r>
-        <w:t>Sometimes, domestic violence does not make either spouse uncomfortable or afraid to ask for what they want in the {{ "Parenting Plan or " if minor_children else "" }}property &amp; debt division.</w:t>
-      </w:r>
-    </w:p>
-    <w:p>
-      <w:pPr>
-        <w:pStyle w:val="Body"/>
-      </w:pPr>
-      <w:r>
-        <w:t>If the domestic violence does make a spouse uncomfortable or afraid, provisions are used to make the process of trying to reach an agreement feel safer (having a support person present, having a mediator or a trusted third person help with discussions, not meeting in-person, meeting in different rooms, or talking about an agreement through email, text or telephone).</w:t>
-      </w:r>
-    </w:p>
-    <w:p>
-      <w:pPr>
-        <w:pStyle w:val="Body"/>
-      </w:pPr>
-      <w:r>
-        <w:t xml:space="preserve">Sometimes, one spouse's main goal is to finish the case and be done in a safe manner so they are willing to give up some things in the agreement that they may be entitled to under the law. </w:t>
+        <w:t>or (</w:t>
       </w:r>
       <w:r>
         <w:rPr>
           <w:color w:val="FFC000"/>
         </w:rPr>
-        <w:t>{% endif %}</w:t>
-      </w:r>
-    </w:p>
-    <w:p>
-      <w:pPr>
-        <w:pStyle w:val="Body"/>
-      </w:pPr>
-      <w:r>
-        <w:t>You can decide if you are comfortable trying to reach an agreement with {{ other_party_in_case }} based on the facts and circumstances of your case.</w:t>
-      </w:r>
-      <w:r>
-        <w:rPr>
-          <w:color w:val="FF0000"/>
-        </w:rPr>
-        <w:t>{% endif %}</w:t>
-      </w:r>
-    </w:p>
-    <w:p>
-      <w:pPr>
-        <w:pStyle w:val="Body"/>
-      </w:pPr>
-      <w:r>
-        <w:rPr>
-          <w:color w:val="FF0000"/>
-        </w:rPr>
-        <w:t xml:space="preserve">{% if user_need in ('custody', 'answer custody') or (user_need in ('divorce', 'answer divorce') and </w:t>
-      </w:r>
-      <w:r>
-        <w:rPr>
-          <w:color w:val="FF0000"/>
-        </w:rPr>
-        <w:t>(</w:t>
-      </w:r>
-      <w:r>
-        <w:rPr>
-          <w:color w:val="FF0000"/>
-        </w:rPr>
-        <w:t>minor_children or (not minor_children and wife_is_pregnant in ('husband', 'not husband'))</w:t>
-      </w:r>
-      <w:r>
-        <w:rPr>
-          <w:color w:val="FF0000"/>
+        <w:t>response_to_complaint == 'none' and want_help_to_agree</w:t>
+      </w:r>
+      <w:r>
+        <w:rPr>
+          <w:color w:val="92D050"/>
         </w:rPr>
         <w:t>)</w:t>
       </w:r>
       <w:r>
         <w:rPr>
-          <w:color w:val="FF0000"/>
-        </w:rPr>
-        <w:t>) %}</w:t>
-      </w:r>
-      <w:r>
-        <w:rPr>
           <w:color w:val="FFC000"/>
         </w:rPr>
-        <w:t xml:space="preserve">{% if </w:t>
-      </w:r>
-      <w:r>
-        <w:rPr>
-          <w:color w:val="FF0000"/>
-        </w:rPr>
-        <w:t>(</w:t>
-      </w:r>
+        <w:t>) or (user_need in (‘answer custody’, ‘answer divorce’) and type_of_resonse.all_false()) %}</w:t>
+      </w:r>
+    </w:p>
+    <w:p>
+      <w:pPr>
+        <w:pStyle w:val="Body"/>
+      </w:pPr>
+      <w:r>
+        <w:t>If you want to try to reach an agreement about the Parenting Plan, your options may be limited if there has been domestic violence.</w:t>
+      </w:r>
+    </w:p>
+    <w:p>
+      <w:pPr>
+        <w:pStyle w:val="Heading3"/>
+      </w:pPr>
+      <w:r>
+        <w:t>Your Parenting Plan agreement may be limited if there is domestic violence</w:t>
+      </w:r>
+    </w:p>
+    <w:p>
+      <w:pPr>
+        <w:pStyle w:val="Heading3"/>
+      </w:pPr>
       <w:r>
         <w:rPr>
           <w:color w:val="FFC000"/>
         </w:rPr>
-        <w:t>(user_need == 'answer custody' and (type_of_response.all_true('ak custody case', exclusive=True) or type_of_response.all_true('ak custody case', 'improper service', exclusive=True))</w:t>
-      </w:r>
-      <w:r>
-        <w:rPr>
-          <w:color w:val="FF0000"/>
-        </w:rPr>
-        <w:t>) or (</w:t>
+        <w:t>{%</w:t>
       </w:r>
       <w:r>
         <w:rPr>
           <w:color w:val="FFC000"/>
         </w:rPr>
-        <w:t xml:space="preserve">user_need == 'answer divorce' and (type_of_response.all_true('ak divorce case', exclusive=True) or type_of_response.all_true('ak divorce case', 'improper service', exclusive=True)) and (case_type == 'divorce' or (case_type == 'legal separation' and want_legal_separation == 'yes')))) and (response_to_complaint in ('agree', 'some') or (response_to_complaint == 'none' and </w:t>
-      </w:r>
-      <w:proofErr w:type="spellStart"/>
+        <w:t>p</w:t>
+      </w:r>
       <w:r>
         <w:rPr>
           <w:color w:val="FFC000"/>
         </w:rPr>
-        <w:t>want_help_to_agree</w:t>
-      </w:r>
-      <w:proofErr w:type="spellEnd"/>
+        <w:t xml:space="preserve"> else %}</w:t>
+      </w:r>
+    </w:p>
+    <w:p>
+      <w:pPr>
+        <w:pStyle w:val="Heading3"/>
+      </w:pPr>
+      <w:r>
+        <w:t>How domestic violence affects {{ case_type }} case</w:t>
+      </w:r>
+    </w:p>
+    <w:p>
+      <w:pPr>
+        <w:pStyle w:val="Heading3"/>
+      </w:pPr>
       <w:r>
         <w:rPr>
           <w:color w:val="FFC000"/>
         </w:rPr>
-        <w:t>)</w:t>
-      </w:r>
-      <w:r>
-        <w:rPr>
-          <w:color w:val="FF0000"/>
-        </w:rPr>
-        <w:t xml:space="preserve">) </w:t>
-      </w:r>
-      <w:r>
-        <w:rPr>
-          <w:color w:val="FF0000"/>
-        </w:rPr>
-        <w:t>or</w:t>
+        <w:t>{%</w:t>
       </w:r>
       <w:r>
         <w:rPr>
           <w:color w:val="FFC000"/>
         </w:rPr>
-        <w:t xml:space="preserve"> </w:t>
-      </w:r>
-      <w:r>
-        <w:rPr>
-          <w:color w:val="FF0000"/>
-        </w:rPr>
-        <w:t>(</w:t>
+        <w:t>p</w:t>
       </w:r>
       <w:r>
         <w:rPr>
           <w:color w:val="FFC000"/>
         </w:rPr>
-        <w:t>user_need in (‘answer custody’, ‘answer divorce’) and type_of_res</w:t>
-      </w:r>
-      <w:r>
-        <w:rPr>
-          <w:color w:val="FFC000"/>
-        </w:rPr>
-        <w:t>p</w:t>
-      </w:r>
-      <w:r>
-        <w:rPr>
-          <w:color w:val="FFC000"/>
-        </w:rPr>
-        <w:t>onse.all_false()</w:t>
-      </w:r>
-      <w:r>
-        <w:rPr>
-          <w:color w:val="FF0000"/>
-        </w:rPr>
-        <w:t>)</w:t>
-      </w:r>
-      <w:r>
-        <w:rPr>
-          <w:color w:val="FFC000"/>
-        </w:rPr>
-        <w:t xml:space="preserve"> </w:t>
-      </w:r>
-      <w:r>
-        <w:rPr>
-          <w:color w:val="FFC000"/>
-        </w:rPr>
-        <w:t>%}</w:t>
-      </w:r>
-      <w:r>
-        <w:t>If you want to try to reach an agreement about the Parenting Plan, your options may be limited if there has been domestic violence.</w:t>
-      </w:r>
-    </w:p>
-    <w:p>
-      <w:pPr>
-        <w:pStyle w:val="Heading3"/>
-      </w:pPr>
-      <w:r>
-        <w:t>Your Parenting Plan agreement may be limited if there is domestic violence</w:t>
-      </w:r>
-      <w:r>
-        <w:rPr>
-          <w:color w:val="FFC000"/>
-        </w:rPr>
-        <w:t>{% else %}</w:t>
-      </w:r>
-      <w:r>
-        <w:t xml:space="preserve">How domestic violence affects </w:t>
-      </w:r>
-      <w:r>
-        <w:t>{{  case_type }} case</w:t>
-      </w:r>
-      <w:r>
-        <w:rPr>
-          <w:color w:val="FFC000"/>
-        </w:rPr>
-        <w:t>{% endif %}</w:t>
+        <w:t xml:space="preserve"> endif %}</w:t>
       </w:r>
     </w:p>
     <w:p>
@@ -459,11 +724,7 @@
         <w:ind w:left="540"/>
       </w:pPr>
       <w:r>
-        <w:t xml:space="preserve">The law presumes that a parent with a "history of domestic violence" not get custody or unsupervised visitation unless they meet certain requirements. These </w:t>
-      </w:r>
-      <w:r>
-        <w:lastRenderedPageBreak/>
-        <w:t>may include completing a batterer's intervention or substance abuse treatment program.</w:t>
+        <w:t>The law presumes that a parent with a "history of domestic violence" not get custody or unsupervised visitation unless they meet certain requirements. These may include completing a batterer's intervention or substance abuse treatment program.</w:t>
       </w:r>
     </w:p>
     <w:p>
@@ -481,13 +742,141 @@
     </w:p>
     <w:p>
       <w:pPr>
+        <w:pStyle w:val="Body"/>
+      </w:pPr>
+      <w:r>
+        <w:rPr>
+          <w:color w:val="FFC000"/>
+        </w:rPr>
+        <w:t>{%</w:t>
+      </w:r>
+      <w:r>
+        <w:rPr>
+          <w:color w:val="FFC000"/>
+        </w:rPr>
+        <w:t>p</w:t>
+      </w:r>
+      <w:r>
+        <w:rPr>
+          <w:color w:val="FFC000"/>
+        </w:rPr>
+        <w:t xml:space="preserve"> if ((user_need == 'answer custody' and (type_of_response.all_true('ak custody case', exclusive=True) or type_of_response.all_true('ak custody case', 'improper service', exclusive=True))) or (user_need == 'answer divorce' and (type_of_response.all_true('ak divorce case', exclusive=True) or type_of_response.all_true('ak divorce case', 'improper service', exclusive=True)) and (case_type == 'divorce' or (case_type == 'legal separation' and want_legal_separation == 'yes')))) and (response_to_complaint in ('agree', 'some') or (response_to_complaint == 'none' and want_help_to_agree)) %}</w:t>
+      </w:r>
+    </w:p>
+    <w:p>
+      <w:pPr>
         <w:pStyle w:val="Heading3"/>
       </w:pPr>
       <w:r>
+        <w:t>Considerations if you and {{ other_party_in_case }} cannot agree</w:t>
+      </w:r>
+    </w:p>
+    <w:p>
+      <w:pPr>
+        <w:pStyle w:val="Body"/>
+      </w:pPr>
+      <w:r>
         <w:rPr>
           <w:color w:val="FFC000"/>
         </w:rPr>
-        <w:t xml:space="preserve">{% if ((user_need == 'answer custody' and (type_of_response.all_true('ak custody case', exclusive=True) or type_of_response.all_true('ak custody case', 'improper service', exclusive=True))) or (user_need == 'answer divorce' and (type_of_response.all_true('ak divorce case', exclusive=True) or type_of_response.all_true('ak divorce case', 'improper service', exclusive=True)) and (case_type == 'divorce' or (case_type == 'legal separation' and want_legal_separation == 'yes')))) and (response_to_complaint in ('agree', 'some') or (response_to_complaint == 'none' and </w:t>
+        <w:t>{%</w:t>
+      </w:r>
+      <w:r>
+        <w:rPr>
+          <w:color w:val="FFC000"/>
+        </w:rPr>
+        <w:t>p</w:t>
+      </w:r>
+      <w:r>
+        <w:rPr>
+          <w:color w:val="FFC000"/>
+        </w:rPr>
+        <w:t xml:space="preserve"> else %}</w:t>
+      </w:r>
+    </w:p>
+    <w:p>
+      <w:pPr>
+        <w:pStyle w:val="Heading3"/>
+      </w:pPr>
+      <w:r>
+        <w:t>Contact between parent and children</w:t>
+      </w:r>
+    </w:p>
+    <w:p>
+      <w:pPr>
+        <w:pStyle w:val="Body"/>
+      </w:pPr>
+      <w:r>
+        <w:rPr>
+          <w:color w:val="FFC000"/>
+        </w:rPr>
+        <w:t>{%</w:t>
+      </w:r>
+      <w:r>
+        <w:rPr>
+          <w:color w:val="FFC000"/>
+        </w:rPr>
+        <w:t>p</w:t>
+      </w:r>
+      <w:r>
+        <w:rPr>
+          <w:color w:val="FFC000"/>
+        </w:rPr>
+        <w:t xml:space="preserve"> endif %}</w:t>
+      </w:r>
+    </w:p>
+    <w:p>
+      <w:pPr>
+        <w:pStyle w:val="Body"/>
+      </w:pPr>
+      <w:r>
+        <w:t xml:space="preserve">If you </w:t>
+      </w:r>
+      <w:r>
+        <w:t>think</w:t>
+      </w:r>
+      <w:r>
+        <w:t xml:space="preserve"> {{ other_party_in_case }} should not have any contact with your children, you need to convince the judge that it is in the children's best interest.</w:t>
+      </w:r>
+    </w:p>
+    <w:p>
+      <w:pPr>
+        <w:pStyle w:val="Body"/>
+      </w:pPr>
+      <w:r>
+        <w:lastRenderedPageBreak/>
+        <w:t>Generally, it is unusual for a judge in a {{ "custody" if user_need in('custody', 'answer custody') else "divorce or legal separation" }} case to decide that a parent cannot see their children. Research shows it is important for children to have a relationship with both parents, if it can happen in a safe manner.</w:t>
+      </w:r>
+    </w:p>
+    <w:p>
+      <w:pPr>
+        <w:pStyle w:val="Body"/>
+      </w:pPr>
+      <w:r>
+        <w:t>If the judge finds the domestic violence presumption applies, the judge will usually permit supervised contact between the parent and the children while the parent is completing a batterer's intervention or substance abuse treatment program. After the parent finishes the program and any other requirements the judge ordered, the judge may lift the supervision restriction and allow a different parenting schedule.</w:t>
+      </w:r>
+    </w:p>
+    <w:p>
+      <w:pPr>
+        <w:pStyle w:val="Body"/>
+      </w:pPr>
+      <w:r>
+        <w:rPr>
+          <w:color w:val="FFC000"/>
+        </w:rPr>
+        <w:t>{%</w:t>
+      </w:r>
+      <w:r>
+        <w:rPr>
+          <w:color w:val="FFC000"/>
+        </w:rPr>
+        <w:t>p</w:t>
+      </w:r>
+      <w:r>
+        <w:rPr>
+          <w:color w:val="FFC000"/>
+        </w:rPr>
+        <w:t xml:space="preserve"> if ((user_need == 'answer custody' and (type_of_response.all_true('ak custody case', exclusive=True) or type_of_response.all_true('ak custody case', 'improper service', exclusive=True))) or (user_need == 'answer divorce' and (type_of_response.all_true('ak divorce case', exclusive=True) or type_of_response.all_true('ak divorce case', 'improper service', exclusive=True)) and (case_type == 'divorce' or (case_type == 'legal separation' and want_legal_separation == 'yes')))) and (response_to_complaint in ('agree', 'some') or (response_to_complaint == 'none' and </w:t>
       </w:r>
       <w:proofErr w:type="spellStart"/>
       <w:r>
@@ -503,119 +892,44 @@
         </w:rPr>
         <w:t>)) %}</w:t>
       </w:r>
-      <w:r>
-        <w:t>Considerations if you and {{ other_party_in_case }} cannot agree</w:t>
-      </w:r>
+    </w:p>
+    <w:p>
+      <w:pPr>
+        <w:pStyle w:val="Heading3"/>
+      </w:pPr>
+      <w:r>
+        <w:t>Tell the judge your concerns</w:t>
+      </w:r>
+    </w:p>
+    <w:p>
+      <w:pPr>
+        <w:pStyle w:val="Body"/>
+      </w:pPr>
       <w:r>
         <w:rPr>
           <w:color w:val="FFC000"/>
         </w:rPr>
-        <w:t>{% else %}</w:t>
-      </w:r>
-      <w:r>
-        <w:t>Contact between parent and children</w:t>
+        <w:t>{%</w:t>
       </w:r>
       <w:r>
         <w:rPr>
           <w:color w:val="FFC000"/>
         </w:rPr>
-        <w:t>{% endif %}</w:t>
-      </w:r>
-    </w:p>
-    <w:p>
-      <w:pPr>
-        <w:pStyle w:val="Body"/>
-      </w:pPr>
-      <w:r>
-        <w:t>If you think {{ other_party_in_case }} should not have any contact with your children, you need to convince the judge that it is in the children's best interest.</w:t>
-      </w:r>
-    </w:p>
-    <w:p>
-      <w:pPr>
-        <w:pStyle w:val="Body"/>
-      </w:pPr>
-      <w:r>
-        <w:t xml:space="preserve">Generally, it is unusual for a judge in </w:t>
-      </w:r>
-      <w:r>
-        <w:t xml:space="preserve">a </w:t>
-      </w:r>
-      <w:r>
-        <w:t>{</w:t>
-      </w:r>
-      <w:r>
-        <w:t>{ "custody" if user_need in('custody', 'answer custody') else "divorce or legal separation" }</w:t>
-      </w:r>
-      <w:r>
-        <w:t xml:space="preserve">} </w:t>
-      </w:r>
-      <w:r>
-        <w:t>case to decide that a parent cannot see their children. Research shows it is important for children to have a relationship with both parents, if it can happen in a safe manner.</w:t>
-      </w:r>
-    </w:p>
-    <w:p>
-      <w:pPr>
-        <w:pStyle w:val="Body"/>
-      </w:pPr>
-      <w:r>
-        <w:t>If the judge finds the domestic violence presumption applies, the judge will usually permit supervised contact between the parent and the children while the parent is completing a batterer's intervention or substance abuse treatment program. After the parent finishes the program and any other requirements the judge ordered, the judge may lift the supervision restriction and allow a different parenting schedule.</w:t>
-      </w:r>
-    </w:p>
-    <w:p>
-      <w:pPr>
-        <w:pStyle w:val="Heading3"/>
-      </w:pPr>
+        <w:t>p</w:t>
+      </w:r>
       <w:r>
         <w:rPr>
           <w:color w:val="FFC000"/>
         </w:rPr>
-        <w:t xml:space="preserve">{% if ((user_need == 'answer custody' and (type_of_response.all_true('ak custody case', exclusive=True) or type_of_response.all_true('ak custody case', 'improper service', </w:t>
-      </w:r>
-      <w:r>
-        <w:rPr>
-          <w:color w:val="FFC000"/>
-        </w:rPr>
-        <w:lastRenderedPageBreak/>
-        <w:t xml:space="preserve">exclusive=True))) or (user_need == 'answer divorce' and (type_of_response.all_true('ak divorce case', exclusive=True) or type_of_response.all_true('ak divorce case', 'improper service', exclusive=True)) and (case_type == 'divorce' or (case_type == 'legal separation' and want_legal_separation == 'yes')))) and (response_to_complaint in ('agree', 'some') or (response_to_complaint == 'none' and </w:t>
-      </w:r>
-      <w:proofErr w:type="spellStart"/>
-      <w:r>
-        <w:rPr>
-          <w:color w:val="FFC000"/>
-        </w:rPr>
-        <w:t>want_help_to_agree</w:t>
-      </w:r>
-      <w:proofErr w:type="spellEnd"/>
-      <w:r>
-        <w:rPr>
-          <w:color w:val="FFC000"/>
-        </w:rPr>
-        <w:t>)) %}</w:t>
-      </w:r>
-      <w:r>
-        <w:t>Tell the judge your concerns</w:t>
-      </w:r>
-      <w:r>
-        <w:rPr>
-          <w:color w:val="FFC000"/>
-        </w:rPr>
-        <w:t>{% endif %}</w:t>
-      </w:r>
-    </w:p>
-    <w:p>
-      <w:pPr>
-        <w:pStyle w:val="Body"/>
-      </w:pPr>
-      <w:r>
-        <w:t xml:space="preserve">The judge will only know about your domestic violence concerns if you state them in the </w:t>
-      </w:r>
-      <w:proofErr w:type="gramStart"/>
-      <w:r>
-        <w:t>documents</w:t>
-      </w:r>
-      <w:proofErr w:type="gramEnd"/>
-      <w:r>
-        <w:t xml:space="preserve"> you file and when you talk in court. If you have concerns for the children's safety when in the care of {{ other_party_in_case }}, or for yourself when interacting with {{ other_party_in_case }}, describe them to the judge. If the judge is going to allow {{ other_party_in_case }} to have parenting time (visitation) with the children, you can suggest ways to address your concerns. Some options include:</w:t>
+        <w:t xml:space="preserve"> endif %}</w:t>
+      </w:r>
+    </w:p>
+    <w:p>
+      <w:pPr>
+        <w:pStyle w:val="Body"/>
+      </w:pPr>
+      <w:r>
+        <w:t>The judge will only know about your domestic violence concerns if you state them in the documents you file and when you talk in court. If you have concerns for the children's safety when in the care of {{ other_party_in_case }}, or for yourself when interacting with {{ other_party_in_case }}, describe them to the judge. If the judge is going to allow {{ other_party_in_case }} to have parenting time (visitation) with the children, you can suggest ways to address your concerns. Some options include:</w:t>
       </w:r>
     </w:p>
     <w:p>
@@ -745,6 +1059,7 @@
         <w:ind w:left="360"/>
       </w:pPr>
       <w:r>
+        <w:lastRenderedPageBreak/>
         <w:t>parenting time only occur in a public or specified place,</w:t>
       </w:r>
     </w:p>
@@ -779,17 +1094,7 @@
         <w:pStyle w:val="Body"/>
       </w:pPr>
       <w:r>
-        <w:t xml:space="preserve">If you think you or your children's health, safety, or liberty would be harmed by providing the information on the </w:t>
-      </w:r>
-      <w:r>
-        <w:rPr>
-          <w:b/>
-          <w:bCs/>
-        </w:rPr>
-        <w:t>Child Custody Jurisdiction Affidavit, DR-150</w:t>
-      </w:r>
-      <w:r>
-        <w:t xml:space="preserve"> to {{ other_party_in_case }}:</w:t>
+        <w:t>If you think you or your children's health, safety, or liberty would be harmed by providing the information on the **Child Custody Jurisdiction Affidavit, DR-150** to {{ other_party_in_case }}:</w:t>
       </w:r>
     </w:p>
     <w:p>
@@ -802,17 +1107,7 @@
         <w:ind w:left="360"/>
       </w:pPr>
       <w:r>
-        <w:t xml:space="preserve">Do not give {{ other_party_in_case }} a copy of the completed </w:t>
-      </w:r>
-      <w:r>
-        <w:rPr>
-          <w:b/>
-          <w:bCs/>
-        </w:rPr>
-        <w:t>Child Custody Jurisdiction Affidavit</w:t>
-      </w:r>
-      <w:r>
-        <w:t xml:space="preserve"> after you file it with the court. and</w:t>
+        <w:t>Do not give {{ other_party_in_case }} a copy of the completed Child Custody Jurisdiction Affidavit after you file it with the court. and</w:t>
       </w:r>
     </w:p>
     <w:p>
@@ -825,7 +1120,6 @@
         <w:ind w:left="360"/>
       </w:pPr>
       <w:r>
-        <w:lastRenderedPageBreak/>
         <w:t xml:space="preserve">File </w:t>
       </w:r>
       <w:bookmarkStart w:id="0" w:name="_Hlk226024791"/>
@@ -849,7 +1143,19 @@
         <w:rPr>
           <w:color w:val="FF0000"/>
         </w:rPr>
-        <w:t>{% endif %}</w:t>
+        <w:t>{%</w:t>
+      </w:r>
+      <w:r>
+        <w:rPr>
+          <w:color w:val="FF0000"/>
+        </w:rPr>
+        <w:t>p</w:t>
+      </w:r>
+      <w:r>
+        <w:rPr>
+          <w:color w:val="FF0000"/>
+        </w:rPr>
+        <w:t xml:space="preserve"> endif %}</w:t>
       </w:r>
     </w:p>
     <w:p>
@@ -864,7 +1170,7 @@
       <w:pPr>
         <w:pStyle w:val="Body"/>
       </w:pPr>
-      <w:hyperlink r:id="rId9" w:history="1">
+      <w:hyperlink r:id="rId11" w:history="1">
         <w:r>
           <w:rPr>
             <w:rStyle w:val="Hyperlink"/>
@@ -876,29 +1182,13 @@
       <w:r>
         <w:br/>
       </w:r>
-      <w:hyperlink r:id="rId10" w:history="1">
+      <w:hyperlink r:id="rId12" w:history="1">
         <w:r>
           <w:rPr>
             <w:rStyle w:val="Hyperlink"/>
             <w:spacing w:val="0"/>
           </w:rPr>
-          <w:t>andvsa.org/</w:t>
-        </w:r>
-        <w:proofErr w:type="spellStart"/>
-        <w:r>
-          <w:rPr>
-            <w:rStyle w:val="Hyperlink"/>
-            <w:spacing w:val="0"/>
-          </w:rPr>
-          <w:t>communitys</w:t>
-        </w:r>
-        <w:proofErr w:type="spellEnd"/>
-        <w:r>
-          <w:rPr>
-            <w:rStyle w:val="Hyperlink"/>
-            <w:spacing w:val="0"/>
-          </w:rPr>
-          <w:t>-programs</w:t>
+          <w:t>andvsa.org/member-organization/</w:t>
         </w:r>
       </w:hyperlink>
     </w:p>
@@ -906,7 +1196,7 @@
       <w:pPr>
         <w:pStyle w:val="Body"/>
       </w:pPr>
-      <w:hyperlink r:id="rId11" w:history="1">
+      <w:hyperlink r:id="rId13" w:history="1">
         <w:r>
           <w:rPr>
             <w:rStyle w:val="Hyperlink"/>
@@ -917,7 +1207,7 @@
       <w:r>
         <w:br/>
       </w:r>
-      <w:hyperlink r:id="rId12" w:history="1">
+      <w:hyperlink r:id="rId14" w:history="1">
         <w:r>
           <w:rPr>
             <w:rStyle w:val="Hyperlink"/>
@@ -938,7 +1228,7 @@
       <w:pPr>
         <w:pStyle w:val="Body"/>
       </w:pPr>
-      <w:hyperlink r:id="rId13" w:history="1">
+      <w:hyperlink r:id="rId15" w:history="1">
         <w:r>
           <w:rPr>
             <w:rStyle w:val="Hyperlink"/>
@@ -949,7 +1239,7 @@
       <w:r>
         <w:br/>
       </w:r>
-      <w:hyperlink r:id="rId14" w:history="1">
+      <w:hyperlink r:id="rId16" w:history="1">
         <w:r>
           <w:rPr>
             <w:rStyle w:val="Hyperlink"/>
@@ -962,10 +1252,11 @@
       <w:pPr>
         <w:pStyle w:val="Body"/>
         <w:rPr>
-          <w:color w:val="FF0000"/>
-        </w:rPr>
-      </w:pPr>
-      <w:hyperlink r:id="rId15" w:history="1">
+          <w:rStyle w:val="Hyperlink"/>
+          <w:color w:val="auto"/>
+        </w:rPr>
+      </w:pPr>
+      <w:hyperlink r:id="rId17" w:history="1">
         <w:r>
           <w:rPr>
             <w:rStyle w:val="Hyperlink"/>
@@ -976,7 +1267,7 @@
       <w:r>
         <w:br/>
       </w:r>
-      <w:hyperlink r:id="rId16" w:history="1">
+      <w:hyperlink r:id="rId18" w:history="1">
         <w:r>
           <w:rPr>
             <w:rStyle w:val="Hyperlink"/>
@@ -984,64 +1275,62 @@
           <w:t>alsc-law.org/apply-for-services</w:t>
         </w:r>
       </w:hyperlink>
+    </w:p>
+    <w:p>
+      <w:pPr>
+        <w:pStyle w:val="Body"/>
+      </w:pPr>
       <w:r>
         <w:rPr>
           <w:color w:val="FF0000"/>
         </w:rPr>
-        <w:t xml:space="preserve">{% if user_need in ('custody', 'answer custody') or (user_need in ('divorce', 'answer divorce') and </w:t>
-      </w:r>
-      <w:r>
-        <w:rPr>
-          <w:color w:val="FF0000"/>
-        </w:rPr>
-        <w:t>(</w:t>
-      </w:r>
-      <w:r>
-        <w:rPr>
-          <w:color w:val="FF0000"/>
-        </w:rPr>
-        <w:t>minor_children or (not minor_children and wife_is_pregnant in ('husband', 'not husband'))</w:t>
-      </w:r>
-      <w:r>
-        <w:rPr>
-          <w:color w:val="FF0000"/>
-        </w:rPr>
-        <w:t>)</w:t>
-      </w:r>
-      <w:r>
-        <w:rPr>
-          <w:color w:val="FF0000"/>
-        </w:rPr>
-        <w:t>) %}</w:t>
-      </w:r>
-    </w:p>
-    <w:p>
-      <w:pPr>
-        <w:pStyle w:val="Body"/>
+        <w:t>{%p if user_need in ('custody', 'answer custody') or (user_need in ('divorce', 'answer divorce') and minor_children or (not minor_children and wife_is_pregnant in ('husband', 'not husband'))) %}</w:t>
+      </w:r>
+    </w:p>
+    <w:p>
+      <w:pPr>
+        <w:pStyle w:val="Body"/>
+        <w:rPr>
+          <w:rStyle w:val="Hyperlink"/>
+          <w:spacing w:val="0"/>
+        </w:rPr>
       </w:pPr>
       <w:r>
         <w:rPr>
           <w:b/>
           <w:bCs/>
         </w:rPr>
-        <w:t>Direction to Seal Child Custody Jurisdiction Affidavit</w:t>
-      </w:r>
-      <w:r>
-        <w:t xml:space="preserve">, </w:t>
-      </w:r>
-      <w:hyperlink r:id="rId17" w:history="1">
+        <w:t>Direction to Seal Child Custody Jurisdiction Affidavit,</w:t>
+      </w:r>
+      <w:r>
+        <w:rPr>
+          <w:b/>
+          <w:bCs/>
+        </w:rPr>
+        <w:t xml:space="preserve"> </w:t>
+      </w:r>
+      <w:r>
+        <w:t>DR-151</w:t>
+      </w:r>
+      <w:r>
+        <w:t xml:space="preserve"> [</w:t>
+      </w:r>
+      <w:hyperlink r:id="rId19" w:history="1">
         <w:r>
           <w:rPr>
             <w:rStyle w:val="Hyperlink"/>
             <w:spacing w:val="0"/>
           </w:rPr>
-          <w:t>DR-151</w:t>
+          <w:t>Fill-In PDF</w:t>
         </w:r>
       </w:hyperlink>
       <w:r>
+        <w:t>]</w:t>
+      </w:r>
+      <w:r>
         <w:br/>
       </w:r>
-      <w:hyperlink r:id="rId18" w:history="1">
+      <w:hyperlink r:id="rId20" w:history="1">
         <w:r>
           <w:rPr>
             <w:rStyle w:val="Hyperlink"/>
@@ -1050,16 +1339,37 @@
           <w:t>ak-courts.info/DR-151</w:t>
         </w:r>
       </w:hyperlink>
-      <w:r>
-        <w:rPr>
-          <w:rStyle w:val="Hyperlink"/>
+    </w:p>
+    <w:p>
+      <w:pPr>
+        <w:pStyle w:val="Body"/>
+      </w:pPr>
+      <w:r>
+        <w:rPr>
           <w:color w:val="FF0000"/>
-          <w:spacing w:val="0"/>
-        </w:rPr>
-        <w:t>{% endif %}</w:t>
+        </w:rPr>
+        <w:t>{%</w:t>
+      </w:r>
+      <w:r>
+        <w:rPr>
+          <w:color w:val="FF0000"/>
+        </w:rPr>
+        <w:t>p</w:t>
+      </w:r>
+      <w:r>
+        <w:rPr>
+          <w:color w:val="FF0000"/>
+        </w:rPr>
+        <w:t xml:space="preserve"> endif %}</w:t>
       </w:r>
     </w:p>
     <w:sectPr>
+      <w:headerReference w:type="even" r:id="rId21"/>
+      <w:headerReference w:type="default" r:id="rId22"/>
+      <w:footerReference w:type="even" r:id="rId23"/>
+      <w:footerReference w:type="default" r:id="rId24"/>
+      <w:headerReference w:type="first" r:id="rId25"/>
+      <w:footerReference w:type="first" r:id="rId26"/>
       <w:pgSz w:w="12240" w:h="15840"/>
       <w:pgMar w:top="1440" w:right="1440" w:bottom="1440" w:left="1440" w:header="720" w:footer="720" w:gutter="0"/>
       <w:cols w:space="720"/>
@@ -1067,6 +1377,116 @@
     </w:sectPr>
   </w:body>
 </w:document>
+</file>
+
+<file path=word/endnotes.xml><?xml version="1.0" encoding="utf-8"?>
+<w:endnotes xmlns:wpc="http://schemas.microsoft.com/office/word/2010/wordprocessingCanvas" xmlns:cx="http://schemas.microsoft.com/office/drawing/2014/chartex" xmlns:cx1="http://schemas.microsoft.com/office/drawing/2015/9/8/chartex" xmlns:cx2="http://schemas.microsoft.com/office/drawing/2015/10/21/chartex" xmlns:cx3="http://schemas.microsoft.com/office/drawing/2016/5/9/chartex" xmlns:cx4="http://schemas.microsoft.com/office/drawing/2016/5/10/chartex" xmlns:cx5="http://schemas.microsoft.com/office/drawing/2016/5/11/chartex" xmlns:cx6="http://schemas.microsoft.com/office/drawing/2016/5/12/chartex" xmlns:cx7="http://schemas.microsoft.com/office/drawing/2016/5/13/chartex" xmlns:cx8="http://schemas.microsoft.com/office/drawing/2016/5/14/chartex" xmlns:mc="http://schemas.openxmlformats.org/markup-compatibility/2006" xmlns:aink="http://schemas.microsoft.com/office/drawing/2016/ink" xmlns:am3d="http://schemas.microsoft.com/office/drawing/2017/model3d" xmlns:o="urn:schemas-microsoft-com:office:office" xmlns:r="http://schemas.openxmlformats.org/officeDocument/2006/relationships" xmlns:m="http://schemas.openxmlformats.org/officeDocument/2006/math" xmlns:v="urn:schemas-microsoft-com:vml" xmlns:wp14="http://schemas.microsoft.com/office/word/2010/wordprocessingDrawing" xmlns:wp="http://schemas.openxmlformats.org/drawingml/2006/wordprocessingDrawing" xmlns:w10="urn:schemas-microsoft-com:office:word" xmlns:w="http://schemas.openxmlformats.org/wordprocessingml/2006/main" xmlns:w14="http://schemas.microsoft.com/office/word/2010/wordml" xmlns:w15="http://schemas.microsoft.com/office/word/2012/wordml" xmlns:w16cex="http://schemas.microsoft.com/office/word/2018/wordml/cex" xmlns:w16cid="http://schemas.microsoft.com/office/word/2016/wordml/cid" xmlns:w16="http://schemas.microsoft.com/office/word/2018/wordml" xmlns:w16sdtdh="http://schemas.microsoft.com/office/word/2020/wordml/sdtdatahash" xmlns:w16se="http://schemas.microsoft.com/office/word/2015/wordml/symex" xmlns:wpg="http://schemas.microsoft.com/office/word/2010/wordprocessingGroup" xmlns:wpi="http://schemas.microsoft.com/office/word/2010/wordprocessingInk" xmlns:wne="http://schemas.microsoft.com/office/word/2006/wordml" xmlns:wps="http://schemas.microsoft.com/office/word/2010/wordprocessingShape" mc:Ignorable="w14 w15 w16se w16cid w16 w16cex w16sdtdh wp14">
+  <w:endnote w:type="separator" w:id="-1">
+    <w:p>
+      <w:pPr>
+        <w:spacing w:before="0" w:after="0"/>
+      </w:pPr>
+      <w:r>
+        <w:separator/>
+      </w:r>
+    </w:p>
+  </w:endnote>
+  <w:endnote w:type="continuationSeparator" w:id="0">
+    <w:p>
+      <w:pPr>
+        <w:spacing w:before="0" w:after="0"/>
+      </w:pPr>
+      <w:r>
+        <w:continuationSeparator/>
+      </w:r>
+    </w:p>
+  </w:endnote>
+</w:endnotes>
+</file>
+
+<file path=word/footer1.xml><?xml version="1.0" encoding="utf-8"?>
+<w:ftr xmlns:wpc="http://schemas.microsoft.com/office/word/2010/wordprocessingCanvas" xmlns:cx="http://schemas.microsoft.com/office/drawing/2014/chartex" xmlns:cx1="http://schemas.microsoft.com/office/drawing/2015/9/8/chartex" xmlns:cx2="http://schemas.microsoft.com/office/drawing/2015/10/21/chartex" xmlns:cx3="http://schemas.microsoft.com/office/drawing/2016/5/9/chartex" xmlns:cx4="http://schemas.microsoft.com/office/drawing/2016/5/10/chartex" xmlns:cx5="http://schemas.microsoft.com/office/drawing/2016/5/11/chartex" xmlns:cx6="http://schemas.microsoft.com/office/drawing/2016/5/12/chartex" xmlns:cx7="http://schemas.microsoft.com/office/drawing/2016/5/13/chartex" xmlns:cx8="http://schemas.microsoft.com/office/drawing/2016/5/14/chartex" xmlns:mc="http://schemas.openxmlformats.org/markup-compatibility/2006" xmlns:aink="http://schemas.microsoft.com/office/drawing/2016/ink" xmlns:am3d="http://schemas.microsoft.com/office/drawing/2017/model3d" xmlns:o="urn:schemas-microsoft-com:office:office" xmlns:r="http://schemas.openxmlformats.org/officeDocument/2006/relationships" xmlns:m="http://schemas.openxmlformats.org/officeDocument/2006/math" xmlns:v="urn:schemas-microsoft-com:vml" xmlns:wp14="http://schemas.microsoft.com/office/word/2010/wordprocessingDrawing" xmlns:wp="http://schemas.openxmlformats.org/drawingml/2006/wordprocessingDrawing" xmlns:w10="urn:schemas-microsoft-com:office:word" xmlns:w="http://schemas.openxmlformats.org/wordprocessingml/2006/main" xmlns:w14="http://schemas.microsoft.com/office/word/2010/wordml" xmlns:w15="http://schemas.microsoft.com/office/word/2012/wordml" xmlns:w16cex="http://schemas.microsoft.com/office/word/2018/wordml/cex" xmlns:w16cid="http://schemas.microsoft.com/office/word/2016/wordml/cid" xmlns:w16="http://schemas.microsoft.com/office/word/2018/wordml" xmlns:w16sdtdh="http://schemas.microsoft.com/office/word/2020/wordml/sdtdatahash" xmlns:w16se="http://schemas.microsoft.com/office/word/2015/wordml/symex" xmlns:wpg="http://schemas.microsoft.com/office/word/2010/wordprocessingGroup" xmlns:wpi="http://schemas.microsoft.com/office/word/2010/wordprocessingInk" xmlns:wne="http://schemas.microsoft.com/office/word/2006/wordml" xmlns:wps="http://schemas.microsoft.com/office/word/2010/wordprocessingShape" mc:Ignorable="w14 w15 w16se w16cid w16 w16cex w16sdtdh wp14">
+  <w:p>
+    <w:pPr>
+      <w:pStyle w:val="Footer"/>
+    </w:pPr>
+  </w:p>
+</w:ftr>
+</file>
+
+<file path=word/footer2.xml><?xml version="1.0" encoding="utf-8"?>
+<w:ftr xmlns:wpc="http://schemas.microsoft.com/office/word/2010/wordprocessingCanvas" xmlns:cx="http://schemas.microsoft.com/office/drawing/2014/chartex" xmlns:cx1="http://schemas.microsoft.com/office/drawing/2015/9/8/chartex" xmlns:cx2="http://schemas.microsoft.com/office/drawing/2015/10/21/chartex" xmlns:cx3="http://schemas.microsoft.com/office/drawing/2016/5/9/chartex" xmlns:cx4="http://schemas.microsoft.com/office/drawing/2016/5/10/chartex" xmlns:cx5="http://schemas.microsoft.com/office/drawing/2016/5/11/chartex" xmlns:cx6="http://schemas.microsoft.com/office/drawing/2016/5/12/chartex" xmlns:cx7="http://schemas.microsoft.com/office/drawing/2016/5/13/chartex" xmlns:cx8="http://schemas.microsoft.com/office/drawing/2016/5/14/chartex" xmlns:mc="http://schemas.openxmlformats.org/markup-compatibility/2006" xmlns:aink="http://schemas.microsoft.com/office/drawing/2016/ink" xmlns:am3d="http://schemas.microsoft.com/office/drawing/2017/model3d" xmlns:o="urn:schemas-microsoft-com:office:office" xmlns:r="http://schemas.openxmlformats.org/officeDocument/2006/relationships" xmlns:m="http://schemas.openxmlformats.org/officeDocument/2006/math" xmlns:v="urn:schemas-microsoft-com:vml" xmlns:wp14="http://schemas.microsoft.com/office/word/2010/wordprocessingDrawing" xmlns:wp="http://schemas.openxmlformats.org/drawingml/2006/wordprocessingDrawing" xmlns:w10="urn:schemas-microsoft-com:office:word" xmlns:w="http://schemas.openxmlformats.org/wordprocessingml/2006/main" xmlns:w14="http://schemas.microsoft.com/office/word/2010/wordml" xmlns:w15="http://schemas.microsoft.com/office/word/2012/wordml" xmlns:w16cex="http://schemas.microsoft.com/office/word/2018/wordml/cex" xmlns:w16cid="http://schemas.microsoft.com/office/word/2016/wordml/cid" xmlns:w16="http://schemas.microsoft.com/office/word/2018/wordml" xmlns:w16sdtdh="http://schemas.microsoft.com/office/word/2020/wordml/sdtdatahash" xmlns:w16se="http://schemas.microsoft.com/office/word/2015/wordml/symex" xmlns:wpg="http://schemas.microsoft.com/office/word/2010/wordprocessingGroup" xmlns:wpi="http://schemas.microsoft.com/office/word/2010/wordprocessingInk" xmlns:wne="http://schemas.microsoft.com/office/word/2006/wordml" xmlns:wps="http://schemas.microsoft.com/office/word/2010/wordprocessingShape" mc:Ignorable="w14 w15 w16se w16cid w16 w16cex w16sdtdh wp14">
+  <w:p>
+    <w:pPr>
+      <w:pStyle w:val="Footer"/>
+    </w:pPr>
+  </w:p>
+</w:ftr>
+</file>
+
+<file path=word/footer3.xml><?xml version="1.0" encoding="utf-8"?>
+<w:ftr xmlns:wpc="http://schemas.microsoft.com/office/word/2010/wordprocessingCanvas" xmlns:cx="http://schemas.microsoft.com/office/drawing/2014/chartex" xmlns:cx1="http://schemas.microsoft.com/office/drawing/2015/9/8/chartex" xmlns:cx2="http://schemas.microsoft.com/office/drawing/2015/10/21/chartex" xmlns:cx3="http://schemas.microsoft.com/office/drawing/2016/5/9/chartex" xmlns:cx4="http://schemas.microsoft.com/office/drawing/2016/5/10/chartex" xmlns:cx5="http://schemas.microsoft.com/office/drawing/2016/5/11/chartex" xmlns:cx6="http://schemas.microsoft.com/office/drawing/2016/5/12/chartex" xmlns:cx7="http://schemas.microsoft.com/office/drawing/2016/5/13/chartex" xmlns:cx8="http://schemas.microsoft.com/office/drawing/2016/5/14/chartex" xmlns:mc="http://schemas.openxmlformats.org/markup-compatibility/2006" xmlns:aink="http://schemas.microsoft.com/office/drawing/2016/ink" xmlns:am3d="http://schemas.microsoft.com/office/drawing/2017/model3d" xmlns:o="urn:schemas-microsoft-com:office:office" xmlns:r="http://schemas.openxmlformats.org/officeDocument/2006/relationships" xmlns:m="http://schemas.openxmlformats.org/officeDocument/2006/math" xmlns:v="urn:schemas-microsoft-com:vml" xmlns:wp14="http://schemas.microsoft.com/office/word/2010/wordprocessingDrawing" xmlns:wp="http://schemas.openxmlformats.org/drawingml/2006/wordprocessingDrawing" xmlns:w10="urn:schemas-microsoft-com:office:word" xmlns:w="http://schemas.openxmlformats.org/wordprocessingml/2006/main" xmlns:w14="http://schemas.microsoft.com/office/word/2010/wordml" xmlns:w15="http://schemas.microsoft.com/office/word/2012/wordml" xmlns:w16cex="http://schemas.microsoft.com/office/word/2018/wordml/cex" xmlns:w16cid="http://schemas.microsoft.com/office/word/2016/wordml/cid" xmlns:w16="http://schemas.microsoft.com/office/word/2018/wordml" xmlns:w16sdtdh="http://schemas.microsoft.com/office/word/2020/wordml/sdtdatahash" xmlns:w16se="http://schemas.microsoft.com/office/word/2015/wordml/symex" xmlns:wpg="http://schemas.microsoft.com/office/word/2010/wordprocessingGroup" xmlns:wpi="http://schemas.microsoft.com/office/word/2010/wordprocessingInk" xmlns:wne="http://schemas.microsoft.com/office/word/2006/wordml" xmlns:wps="http://schemas.microsoft.com/office/word/2010/wordprocessingShape" mc:Ignorable="w14 w15 w16se w16cid w16 w16cex w16sdtdh wp14">
+  <w:p>
+    <w:pPr>
+      <w:pStyle w:val="Footer"/>
+    </w:pPr>
+  </w:p>
+</w:ftr>
+</file>
+
+<file path=word/footnotes.xml><?xml version="1.0" encoding="utf-8"?>
+<w:footnotes xmlns:wpc="http://schemas.microsoft.com/office/word/2010/wordprocessingCanvas" xmlns:cx="http://schemas.microsoft.com/office/drawing/2014/chartex" xmlns:cx1="http://schemas.microsoft.com/office/drawing/2015/9/8/chartex" xmlns:cx2="http://schemas.microsoft.com/office/drawing/2015/10/21/chartex" xmlns:cx3="http://schemas.microsoft.com/office/drawing/2016/5/9/chartex" xmlns:cx4="http://schemas.microsoft.com/office/drawing/2016/5/10/chartex" xmlns:cx5="http://schemas.microsoft.com/office/drawing/2016/5/11/chartex" xmlns:cx6="http://schemas.microsoft.com/office/drawing/2016/5/12/chartex" xmlns:cx7="http://schemas.microsoft.com/office/drawing/2016/5/13/chartex" xmlns:cx8="http://schemas.microsoft.com/office/drawing/2016/5/14/chartex" xmlns:mc="http://schemas.openxmlformats.org/markup-compatibility/2006" xmlns:aink="http://schemas.microsoft.com/office/drawing/2016/ink" xmlns:am3d="http://schemas.microsoft.com/office/drawing/2017/model3d" xmlns:o="urn:schemas-microsoft-com:office:office" xmlns:r="http://schemas.openxmlformats.org/officeDocument/2006/relationships" xmlns:m="http://schemas.openxmlformats.org/officeDocument/2006/math" xmlns:v="urn:schemas-microsoft-com:vml" xmlns:wp14="http://schemas.microsoft.com/office/word/2010/wordprocessingDrawing" xmlns:wp="http://schemas.openxmlformats.org/drawingml/2006/wordprocessingDrawing" xmlns:w10="urn:schemas-microsoft-com:office:word" xmlns:w="http://schemas.openxmlformats.org/wordprocessingml/2006/main" xmlns:w14="http://schemas.microsoft.com/office/word/2010/wordml" xmlns:w15="http://schemas.microsoft.com/office/word/2012/wordml" xmlns:w16cex="http://schemas.microsoft.com/office/word/2018/wordml/cex" xmlns:w16cid="http://schemas.microsoft.com/office/word/2016/wordml/cid" xmlns:w16="http://schemas.microsoft.com/office/word/2018/wordml" xmlns:w16sdtdh="http://schemas.microsoft.com/office/word/2020/wordml/sdtdatahash" xmlns:w16se="http://schemas.microsoft.com/office/word/2015/wordml/symex" xmlns:wpg="http://schemas.microsoft.com/office/word/2010/wordprocessingGroup" xmlns:wpi="http://schemas.microsoft.com/office/word/2010/wordprocessingInk" xmlns:wne="http://schemas.microsoft.com/office/word/2006/wordml" xmlns:wps="http://schemas.microsoft.com/office/word/2010/wordprocessingShape" mc:Ignorable="w14 w15 w16se w16cid w16 w16cex w16sdtdh wp14">
+  <w:footnote w:type="separator" w:id="-1">
+    <w:p>
+      <w:pPr>
+        <w:spacing w:before="0" w:after="0"/>
+      </w:pPr>
+      <w:r>
+        <w:separator/>
+      </w:r>
+    </w:p>
+  </w:footnote>
+  <w:footnote w:type="continuationSeparator" w:id="0">
+    <w:p>
+      <w:pPr>
+        <w:spacing w:before="0" w:after="0"/>
+      </w:pPr>
+      <w:r>
+        <w:continuationSeparator/>
+      </w:r>
+    </w:p>
+  </w:footnote>
+</w:footnotes>
+</file>
+
+<file path=word/header1.xml><?xml version="1.0" encoding="utf-8"?>
+<w:hdr xmlns:wpc="http://schemas.microsoft.com/office/word/2010/wordprocessingCanvas" xmlns:cx="http://schemas.microsoft.com/office/drawing/2014/chartex" xmlns:cx1="http://schemas.microsoft.com/office/drawing/2015/9/8/chartex" xmlns:cx2="http://schemas.microsoft.com/office/drawing/2015/10/21/chartex" xmlns:cx3="http://schemas.microsoft.com/office/drawing/2016/5/9/chartex" xmlns:cx4="http://schemas.microsoft.com/office/drawing/2016/5/10/chartex" xmlns:cx5="http://schemas.microsoft.com/office/drawing/2016/5/11/chartex" xmlns:cx6="http://schemas.microsoft.com/office/drawing/2016/5/12/chartex" xmlns:cx7="http://schemas.microsoft.com/office/drawing/2016/5/13/chartex" xmlns:cx8="http://schemas.microsoft.com/office/drawing/2016/5/14/chartex" xmlns:mc="http://schemas.openxmlformats.org/markup-compatibility/2006" xmlns:aink="http://schemas.microsoft.com/office/drawing/2016/ink" xmlns:am3d="http://schemas.microsoft.com/office/drawing/2017/model3d" xmlns:o="urn:schemas-microsoft-com:office:office" xmlns:r="http://schemas.openxmlformats.org/officeDocument/2006/relationships" xmlns:m="http://schemas.openxmlformats.org/officeDocument/2006/math" xmlns:v="urn:schemas-microsoft-com:vml" xmlns:wp14="http://schemas.microsoft.com/office/word/2010/wordprocessingDrawing" xmlns:wp="http://schemas.openxmlformats.org/drawingml/2006/wordprocessingDrawing" xmlns:w10="urn:schemas-microsoft-com:office:word" xmlns:w="http://schemas.openxmlformats.org/wordprocessingml/2006/main" xmlns:w14="http://schemas.microsoft.com/office/word/2010/wordml" xmlns:w15="http://schemas.microsoft.com/office/word/2012/wordml" xmlns:w16cex="http://schemas.microsoft.com/office/word/2018/wordml/cex" xmlns:w16cid="http://schemas.microsoft.com/office/word/2016/wordml/cid" xmlns:w16="http://schemas.microsoft.com/office/word/2018/wordml" xmlns:w16sdtdh="http://schemas.microsoft.com/office/word/2020/wordml/sdtdatahash" xmlns:w16se="http://schemas.microsoft.com/office/word/2015/wordml/symex" xmlns:wpg="http://schemas.microsoft.com/office/word/2010/wordprocessingGroup" xmlns:wpi="http://schemas.microsoft.com/office/word/2010/wordprocessingInk" xmlns:wne="http://schemas.microsoft.com/office/word/2006/wordml" xmlns:wps="http://schemas.microsoft.com/office/word/2010/wordprocessingShape" mc:Ignorable="w14 w15 w16se w16cid w16 w16cex w16sdtdh wp14">
+  <w:p>
+    <w:pPr>
+      <w:pStyle w:val="Header"/>
+    </w:pPr>
+  </w:p>
+</w:hdr>
+</file>
+
+<file path=word/header2.xml><?xml version="1.0" encoding="utf-8"?>
+<w:hdr xmlns:wpc="http://schemas.microsoft.com/office/word/2010/wordprocessingCanvas" xmlns:cx="http://schemas.microsoft.com/office/drawing/2014/chartex" xmlns:cx1="http://schemas.microsoft.com/office/drawing/2015/9/8/chartex" xmlns:cx2="http://schemas.microsoft.com/office/drawing/2015/10/21/chartex" xmlns:cx3="http://schemas.microsoft.com/office/drawing/2016/5/9/chartex" xmlns:cx4="http://schemas.microsoft.com/office/drawing/2016/5/10/chartex" xmlns:cx5="http://schemas.microsoft.com/office/drawing/2016/5/11/chartex" xmlns:cx6="http://schemas.microsoft.com/office/drawing/2016/5/12/chartex" xmlns:cx7="http://schemas.microsoft.com/office/drawing/2016/5/13/chartex" xmlns:cx8="http://schemas.microsoft.com/office/drawing/2016/5/14/chartex" xmlns:mc="http://schemas.openxmlformats.org/markup-compatibility/2006" xmlns:aink="http://schemas.microsoft.com/office/drawing/2016/ink" xmlns:am3d="http://schemas.microsoft.com/office/drawing/2017/model3d" xmlns:o="urn:schemas-microsoft-com:office:office" xmlns:r="http://schemas.openxmlformats.org/officeDocument/2006/relationships" xmlns:m="http://schemas.openxmlformats.org/officeDocument/2006/math" xmlns:v="urn:schemas-microsoft-com:vml" xmlns:wp14="http://schemas.microsoft.com/office/word/2010/wordprocessingDrawing" xmlns:wp="http://schemas.openxmlformats.org/drawingml/2006/wordprocessingDrawing" xmlns:w10="urn:schemas-microsoft-com:office:word" xmlns:w="http://schemas.openxmlformats.org/wordprocessingml/2006/main" xmlns:w14="http://schemas.microsoft.com/office/word/2010/wordml" xmlns:w15="http://schemas.microsoft.com/office/word/2012/wordml" xmlns:w16cex="http://schemas.microsoft.com/office/word/2018/wordml/cex" xmlns:w16cid="http://schemas.microsoft.com/office/word/2016/wordml/cid" xmlns:w16="http://schemas.microsoft.com/office/word/2018/wordml" xmlns:w16sdtdh="http://schemas.microsoft.com/office/word/2020/wordml/sdtdatahash" xmlns:w16se="http://schemas.microsoft.com/office/word/2015/wordml/symex" xmlns:wpg="http://schemas.microsoft.com/office/word/2010/wordprocessingGroup" xmlns:wpi="http://schemas.microsoft.com/office/word/2010/wordprocessingInk" xmlns:wne="http://schemas.microsoft.com/office/word/2006/wordml" xmlns:wps="http://schemas.microsoft.com/office/word/2010/wordprocessingShape" mc:Ignorable="w14 w15 w16se w16cid w16 w16cex w16sdtdh wp14">
+  <w:p>
+    <w:pPr>
+      <w:pStyle w:val="Header"/>
+    </w:pPr>
+  </w:p>
+</w:hdr>
+</file>
+
+<file path=word/header3.xml><?xml version="1.0" encoding="utf-8"?>
+<w:hdr xmlns:wpc="http://schemas.microsoft.com/office/word/2010/wordprocessingCanvas" xmlns:cx="http://schemas.microsoft.com/office/drawing/2014/chartex" xmlns:cx1="http://schemas.microsoft.com/office/drawing/2015/9/8/chartex" xmlns:cx2="http://schemas.microsoft.com/office/drawing/2015/10/21/chartex" xmlns:cx3="http://schemas.microsoft.com/office/drawing/2016/5/9/chartex" xmlns:cx4="http://schemas.microsoft.com/office/drawing/2016/5/10/chartex" xmlns:cx5="http://schemas.microsoft.com/office/drawing/2016/5/11/chartex" xmlns:cx6="http://schemas.microsoft.com/office/drawing/2016/5/12/chartex" xmlns:cx7="http://schemas.microsoft.com/office/drawing/2016/5/13/chartex" xmlns:cx8="http://schemas.microsoft.com/office/drawing/2016/5/14/chartex" xmlns:mc="http://schemas.openxmlformats.org/markup-compatibility/2006" xmlns:aink="http://schemas.microsoft.com/office/drawing/2016/ink" xmlns:am3d="http://schemas.microsoft.com/office/drawing/2017/model3d" xmlns:o="urn:schemas-microsoft-com:office:office" xmlns:r="http://schemas.openxmlformats.org/officeDocument/2006/relationships" xmlns:m="http://schemas.openxmlformats.org/officeDocument/2006/math" xmlns:v="urn:schemas-microsoft-com:vml" xmlns:wp14="http://schemas.microsoft.com/office/word/2010/wordprocessingDrawing" xmlns:wp="http://schemas.openxmlformats.org/drawingml/2006/wordprocessingDrawing" xmlns:w10="urn:schemas-microsoft-com:office:word" xmlns:w="http://schemas.openxmlformats.org/wordprocessingml/2006/main" xmlns:w14="http://schemas.microsoft.com/office/word/2010/wordml" xmlns:w15="http://schemas.microsoft.com/office/word/2012/wordml" xmlns:w16cex="http://schemas.microsoft.com/office/word/2018/wordml/cex" xmlns:w16cid="http://schemas.microsoft.com/office/word/2016/wordml/cid" xmlns:w16="http://schemas.microsoft.com/office/word/2018/wordml" xmlns:w16sdtdh="http://schemas.microsoft.com/office/word/2020/wordml/sdtdatahash" xmlns:w16se="http://schemas.microsoft.com/office/word/2015/wordml/symex" xmlns:wpg="http://schemas.microsoft.com/office/word/2010/wordprocessingGroup" xmlns:wpi="http://schemas.microsoft.com/office/word/2010/wordprocessingInk" xmlns:wne="http://schemas.microsoft.com/office/word/2006/wordml" xmlns:wps="http://schemas.microsoft.com/office/word/2010/wordprocessingShape" mc:Ignorable="w14 w15 w16se w16cid w16 w16cex w16sdtdh wp14">
+  <w:p>
+    <w:pPr>
+      <w:pStyle w:val="Header"/>
+    </w:pPr>
+  </w:p>
+</w:hdr>
 </file>
 
 <file path=word/numbering.xml><?xml version="1.0" encoding="utf-8"?>
@@ -3299,7 +3719,6 @@
   <w:style w:type="character" w:default="1" w:styleId="DefaultParagraphFont">
     <w:name w:val="Default Paragraph Font"/>
     <w:uiPriority w:val="1"/>
-    <w:semiHidden/>
     <w:unhideWhenUsed/>
   </w:style>
   <w:style w:type="table" w:default="1" w:styleId="TableNormal">

</xml_diff>

<commit_message>
updated domestic_violence_content and want_help_to_agree content, typos in both
</commit_message>
<xml_diff>
--- a/docassemble/AKA2JBranding/data/templates/answer_domestic_violence_content.docx
+++ b/docassemble/AKA2JBranding/data/templates/answer_domestic_violence_content.docx
@@ -688,7 +688,21 @@
         <w:pStyle w:val="Heading3"/>
       </w:pPr>
       <w:r>
-        <w:t>How domestic violence affects {{ case_type }} case</w:t>
+        <w:t>How domestic violence affects</w:t>
+      </w:r>
+      <w:r>
+        <w:t xml:space="preserve"> a</w:t>
+      </w:r>
+      <w:r>
+        <w:t xml:space="preserve"> {{ </w:t>
+      </w:r>
+      <w:proofErr w:type="spellStart"/>
+      <w:r>
+        <w:t>case_type</w:t>
+      </w:r>
+      <w:proofErr w:type="spellEnd"/>
+      <w:r>
+        <w:t xml:space="preserve"> }} case</w:t>
       </w:r>
     </w:p>
     <w:p>

</xml_diff>